<commit_message>
Commit project 4 handout and notebook re-runs
Adds the built project_4.pdf alongside the updated .docx; the notebook
changes are re-execution output only, no source edits.

Co-Authored-By: Claude Opus 5 (1M context) <noreply@anthropic.com>
</commit_message>
<xml_diff>
--- a/assignement/project_4.docx
+++ b/assignement/project_4.docx
@@ -57,29 +57,6 @@
           <w:b/>
           <w:i/>
           <w:i/>
-          <w:sz w:val="20"/>
-          <w:szCs w:val="20"/>
-        </w:rPr>
-      </w:pPr>
-      <w:r>
-        <w:rPr>
-          <w:rFonts w:eastAsia="Calibri" w:cs="Calibri" w:ascii="Calibri" w:hAnsi="Calibri"/>
-          <w:b/>
-          <w:i/>
-          <w:sz w:val="20"/>
-          <w:szCs w:val="20"/>
-        </w:rPr>
-      </w:r>
-    </w:p>
-    <w:p>
-      <w:pPr>
-        <w:pStyle w:val="normal1"/>
-        <w:spacing w:lineRule="auto" w:line="240" w:before="240" w:after="240"/>
-        <w:rPr>
-          <w:rFonts w:ascii="Calibri" w:hAnsi="Calibri" w:eastAsia="Calibri" w:cs="Calibri"/>
-          <w:b/>
-          <w:i/>
-          <w:i/>
           <w:sz w:val="30"/>
           <w:szCs w:val="30"/>
         </w:rPr>
@@ -92,18 +69,21 @@
           <w:sz w:val="30"/>
           <w:szCs w:val="30"/>
         </w:rPr>
-        <w:t xml:space="preserve">Assignment </w:t>
-      </w:r>
-      <w:r>
-        <w:rPr>
-          <w:rFonts w:eastAsia="Calibri" w:cs="Calibri" w:ascii="Calibri" w:hAnsi="Calibri"/>
-          <w:b/>
+      </w:r>
+    </w:p>
+    <w:p>
+      <w:pPr>
+        <w:pStyle w:val="normal1"/>
+        <w:spacing w:lineRule="auto" w:line="240" w:before="240" w:after="240"/>
+        <w:rPr>
+          <w:rFonts w:ascii="Calibri" w:hAnsi="Calibri" w:eastAsia="Calibri" w:cs="Calibri"/>
+          <w:b/>
+          <w:i/>
           <w:i/>
           <w:sz w:val="30"/>
           <w:szCs w:val="30"/>
         </w:rPr>
-        <w:t>4</w:t>
-      </w:r>
+      </w:pPr>
       <w:r>
         <w:rPr>
           <w:rFonts w:eastAsia="Calibri" w:cs="Calibri" w:ascii="Calibri" w:hAnsi="Calibri"/>
@@ -112,119 +92,94 @@
           <w:sz w:val="30"/>
           <w:szCs w:val="30"/>
         </w:rPr>
-        <w:t xml:space="preserve"> (</w:t>
-      </w:r>
-      <w:r>
-        <w:rPr>
-          <w:rFonts w:eastAsia="Calibri" w:cs="Calibri" w:ascii="Calibri" w:hAnsi="Calibri"/>
-          <w:b w:val="false"/>
-          <w:bCs w:val="false"/>
-          <w:i/>
-          <w:sz w:val="30"/>
-          <w:szCs w:val="30"/>
-        </w:rPr>
-        <w:t>Deadline</w:t>
-      </w:r>
-      <w:r>
-        <w:rPr>
-          <w:rFonts w:eastAsia="Calibri" w:cs="Calibri" w:ascii="Calibri" w:hAnsi="Calibri"/>
-          <w:b/>
-          <w:i/>
-          <w:sz w:val="30"/>
-          <w:szCs w:val="30"/>
-        </w:rPr>
-        <w:t xml:space="preserve"> </w:t>
-      </w:r>
-      <w:r>
-        <w:rPr>
-          <w:rFonts w:eastAsia="Calibri" w:cs="Calibri" w:ascii="Calibri" w:hAnsi="Calibri"/>
-          <w:b/>
-          <w:i/>
-          <w:sz w:val="30"/>
-          <w:szCs w:val="30"/>
-        </w:rPr>
-        <w:t>10</w:t>
+        <w:t xml:space="preserve">Assignment 4 </w:t>
+      </w:r>
+      <w:r>
+        <w:rPr>
+          <w:rFonts w:eastAsia="Calibri" w:cs="Calibri" w:ascii="Calibri" w:hAnsi="Calibri"/>
+          <w:b w:val="false"/>
+          <w:bCs w:val="false"/>
+          <w:i/>
+          <w:sz w:val="28"/>
+          <w:szCs w:val="28"/>
+        </w:rPr>
+        <w:t xml:space="preserve">(Deadline </w:t>
+      </w:r>
+      <w:r>
+        <w:rPr>
+          <w:rFonts w:eastAsia="Calibri" w:cs="Calibri" w:ascii="Calibri" w:hAnsi="Calibri"/>
+          <w:b w:val="false"/>
+          <w:bCs w:val="false"/>
+          <w:i/>
+          <w:sz w:val="28"/>
+          <w:szCs w:val="28"/>
+        </w:rPr>
+        <w:t>5</w:t>
       </w:r>
       <w:r>
         <w:rPr>
           <w:rFonts w:ascii="sans-serif" w:hAnsi="sans-serif"/>
-          <w:sz w:val="24"/>
-        </w:rPr>
-        <w:t xml:space="preserve">. </w:t>
-      </w:r>
-      <w:r>
-        <w:rPr>
-          <w:rFonts w:ascii="sans-serif" w:hAnsi="sans-serif"/>
-          <w:sz w:val="24"/>
-        </w:rPr>
-        <w:t>December</w:t>
-      </w:r>
-      <w:r>
-        <w:rPr>
-          <w:rFonts w:ascii="sans-serif" w:hAnsi="sans-serif"/>
-          <w:sz w:val="24"/>
-        </w:rPr>
-        <w:t xml:space="preserve"> 23:59)</w:t>
-      </w:r>
-    </w:p>
-    <w:p>
-      <w:pPr>
-        <w:pStyle w:val="normal1"/>
-        <w:spacing w:lineRule="auto" w:line="240" w:before="240" w:after="240"/>
-        <w:rPr>
-          <w:rFonts w:ascii="Calibri" w:hAnsi="Calibri" w:eastAsia="Calibri" w:cs="Calibri"/>
-          <w:b/>
-          <w:i/>
-          <w:i/>
-          <w:sz w:val="20"/>
-          <w:szCs w:val="20"/>
-        </w:rPr>
-      </w:pPr>
-      <w:r>
-        <w:rPr>
-          <w:rFonts w:eastAsia="Calibri" w:cs="Calibri" w:ascii="Calibri" w:hAnsi="Calibri"/>
-          <w:b/>
-          <w:i/>
-          <w:sz w:val="20"/>
-          <w:szCs w:val="20"/>
-        </w:rPr>
-        <w:t xml:space="preserve">TOPIC 1: </w:t>
-      </w:r>
-      <w:r>
-        <w:rPr>
-          <w:rFonts w:eastAsia="Calibri" w:cs="Calibri" w:ascii="Calibri" w:hAnsi="Calibri"/>
-          <w:b/>
-          <w:i/>
-          <w:sz w:val="20"/>
-          <w:szCs w:val="20"/>
-        </w:rPr>
-        <w:t>Unsupervised learning: Clustering the Milky Way</w:t>
-      </w:r>
-    </w:p>
-    <w:p>
-      <w:pPr>
-        <w:pStyle w:val="normal1"/>
-        <w:spacing w:lineRule="auto" w:line="240" w:before="240" w:after="240"/>
-        <w:rPr>
-          <w:rFonts w:ascii="Calibri" w:hAnsi="Calibri" w:eastAsia="Calibri" w:cs="Calibri"/>
-          <w:i/>
-          <w:i/>
-          <w:sz w:val="20"/>
-          <w:szCs w:val="20"/>
-        </w:rPr>
-      </w:pPr>
-      <w:r>
-        <w:rPr/>
+          <w:b w:val="false"/>
+          <w:bCs w:val="false"/>
+          <w:sz w:val="28"/>
+          <w:szCs w:val="28"/>
+        </w:rPr>
+        <w:t>. December 23:59)</w:t>
+      </w:r>
+    </w:p>
+    <w:p>
+      <w:pPr>
+        <w:pStyle w:val="normal1"/>
+        <w:spacing w:lineRule="auto" w:line="240" w:before="240" w:after="240"/>
+        <w:rPr>
+          <w:rFonts w:ascii="Calibri" w:hAnsi="Calibri" w:eastAsia="Calibri" w:cs="Calibri"/>
+          <w:b/>
+          <w:i/>
+          <w:i/>
+          <w:sz w:val="20"/>
+          <w:szCs w:val="20"/>
+        </w:rPr>
+      </w:pPr>
+      <w:r>
+        <w:rPr>
+          <w:rFonts w:eastAsia="Calibri" w:cs="Calibri" w:ascii="Calibri" w:hAnsi="Calibri"/>
+          <w:b/>
+          <w:i/>
+          <w:sz w:val="20"/>
+          <w:szCs w:val="20"/>
+        </w:rPr>
+        <w:t>TOPIC 1: Unsupervised learning: Clustering the Milky Way</w:t>
+      </w:r>
+    </w:p>
+    <w:p>
+      <w:pPr>
+        <w:pStyle w:val="normal1"/>
+        <w:spacing w:lineRule="auto" w:line="240" w:before="240" w:after="240"/>
+        <w:rPr>
+          <w:rFonts w:ascii="Calibri" w:hAnsi="Calibri" w:eastAsia="Calibri" w:cs="Calibri"/>
+          <w:i/>
+          <w:i/>
+          <w:sz w:val="20"/>
+          <w:szCs w:val="20"/>
+        </w:rPr>
+      </w:pPr>
+      <w:r>
+        <w:rPr>
+          <w:rFonts w:eastAsia="Calibri" w:cs="Calibri" w:ascii="Calibri" w:hAnsi="Calibri"/>
+          <w:i/>
+          <w:sz w:val="20"/>
+          <w:szCs w:val="20"/>
+        </w:rPr>
         <w:drawing>
           <wp:anchor behindDoc="0" distT="0" distB="0" distL="0" distR="0" simplePos="0" locked="0" layoutInCell="0" allowOverlap="1" relativeHeight="2">
             <wp:simplePos x="0" y="0"/>
             <wp:positionH relativeFrom="column">
-              <wp:align>center</wp:align>
+              <wp:posOffset>256540</wp:posOffset>
             </wp:positionH>
             <wp:positionV relativeFrom="paragraph">
-              <wp:posOffset>635</wp:posOffset>
+              <wp:posOffset>27940</wp:posOffset>
             </wp:positionV>
-            <wp:extent cx="5731510" cy="5592445"/>
+            <wp:extent cx="5306060" cy="5177155"/>
             <wp:effectExtent l="0" t="0" r="0" b="0"/>
             <wp:wrapSquare wrapText="largest"/>
             <wp:docPr id="1" name="Image1"/>
@@ -249,7 +204,7 @@
                   <pic:spPr bwMode="auto">
                     <a:xfrm>
                       <a:off x="0" y="0"/>
-                      <a:ext cx="5731510" cy="5592445"/>
+                      <a:ext cx="5306060" cy="5177155"/>
                     </a:xfrm>
                     <a:prstGeom prst="rect">
                       <a:avLst/>
@@ -282,6 +237,222 @@
           <w:sz w:val="20"/>
           <w:szCs w:val="20"/>
         </w:rPr>
+      </w:r>
+    </w:p>
+    <w:p>
+      <w:pPr>
+        <w:pStyle w:val="normal1"/>
+        <w:spacing w:lineRule="auto" w:line="240" w:before="240" w:after="240"/>
+        <w:rPr>
+          <w:rFonts w:ascii="Calibri" w:hAnsi="Calibri" w:eastAsia="Calibri" w:cs="Calibri"/>
+          <w:i/>
+          <w:i/>
+          <w:sz w:val="20"/>
+          <w:szCs w:val="20"/>
+        </w:rPr>
+      </w:pPr>
+      <w:r>
+        <w:rPr>
+          <w:rFonts w:eastAsia="Calibri" w:cs="Calibri" w:ascii="Calibri" w:hAnsi="Calibri"/>
+          <w:i/>
+          <w:sz w:val="20"/>
+          <w:szCs w:val="20"/>
+        </w:rPr>
+      </w:r>
+    </w:p>
+    <w:p>
+      <w:pPr>
+        <w:pStyle w:val="normal1"/>
+        <w:spacing w:lineRule="auto" w:line="240" w:before="240" w:after="240"/>
+        <w:rPr>
+          <w:rFonts w:ascii="Calibri" w:hAnsi="Calibri" w:eastAsia="Calibri" w:cs="Calibri"/>
+          <w:i/>
+          <w:i/>
+          <w:sz w:val="20"/>
+          <w:szCs w:val="20"/>
+        </w:rPr>
+      </w:pPr>
+      <w:r>
+        <w:rPr>
+          <w:rFonts w:eastAsia="Calibri" w:cs="Calibri" w:ascii="Calibri" w:hAnsi="Calibri"/>
+          <w:i/>
+          <w:sz w:val="20"/>
+          <w:szCs w:val="20"/>
+        </w:rPr>
+      </w:r>
+    </w:p>
+    <w:p>
+      <w:pPr>
+        <w:pStyle w:val="normal1"/>
+        <w:spacing w:lineRule="auto" w:line="240" w:before="240" w:after="240"/>
+        <w:rPr>
+          <w:rFonts w:ascii="Calibri" w:hAnsi="Calibri" w:eastAsia="Calibri" w:cs="Calibri"/>
+          <w:i/>
+          <w:i/>
+          <w:sz w:val="20"/>
+          <w:szCs w:val="20"/>
+        </w:rPr>
+      </w:pPr>
+      <w:r>
+        <w:rPr>
+          <w:rFonts w:eastAsia="Calibri" w:cs="Calibri" w:ascii="Calibri" w:hAnsi="Calibri"/>
+          <w:i/>
+          <w:sz w:val="20"/>
+          <w:szCs w:val="20"/>
+        </w:rPr>
+      </w:r>
+    </w:p>
+    <w:p>
+      <w:pPr>
+        <w:pStyle w:val="normal1"/>
+        <w:spacing w:lineRule="auto" w:line="240" w:before="240" w:after="240"/>
+        <w:rPr>
+          <w:rFonts w:ascii="Calibri" w:hAnsi="Calibri" w:eastAsia="Calibri" w:cs="Calibri"/>
+          <w:i/>
+          <w:i/>
+          <w:sz w:val="20"/>
+          <w:szCs w:val="20"/>
+        </w:rPr>
+      </w:pPr>
+      <w:r>
+        <w:rPr>
+          <w:rFonts w:eastAsia="Calibri" w:cs="Calibri" w:ascii="Calibri" w:hAnsi="Calibri"/>
+          <w:i/>
+          <w:sz w:val="20"/>
+          <w:szCs w:val="20"/>
+        </w:rPr>
+      </w:r>
+    </w:p>
+    <w:p>
+      <w:pPr>
+        <w:pStyle w:val="normal1"/>
+        <w:spacing w:lineRule="auto" w:line="240" w:before="240" w:after="240"/>
+        <w:rPr>
+          <w:rFonts w:ascii="Calibri" w:hAnsi="Calibri" w:eastAsia="Calibri" w:cs="Calibri"/>
+          <w:i/>
+          <w:i/>
+          <w:sz w:val="20"/>
+          <w:szCs w:val="20"/>
+        </w:rPr>
+      </w:pPr>
+      <w:r>
+        <w:rPr>
+          <w:rFonts w:eastAsia="Calibri" w:cs="Calibri" w:ascii="Calibri" w:hAnsi="Calibri"/>
+          <w:i/>
+          <w:sz w:val="20"/>
+          <w:szCs w:val="20"/>
+        </w:rPr>
+      </w:r>
+    </w:p>
+    <w:p>
+      <w:pPr>
+        <w:pStyle w:val="normal1"/>
+        <w:spacing w:lineRule="auto" w:line="240" w:before="240" w:after="240"/>
+        <w:rPr>
+          <w:rFonts w:ascii="Calibri" w:hAnsi="Calibri" w:eastAsia="Calibri" w:cs="Calibri"/>
+          <w:i/>
+          <w:i/>
+          <w:sz w:val="20"/>
+          <w:szCs w:val="20"/>
+        </w:rPr>
+      </w:pPr>
+      <w:r>
+        <w:rPr>
+          <w:rFonts w:eastAsia="Calibri" w:cs="Calibri" w:ascii="Calibri" w:hAnsi="Calibri"/>
+          <w:b w:val="false"/>
+          <w:bCs w:val="false"/>
+          <w:i/>
+          <w:sz w:val="20"/>
+          <w:szCs w:val="20"/>
+        </w:rPr>
+        <w:t xml:space="preserve">Task 0:  </w:t>
+      </w:r>
+      <w:r>
+        <w:rPr>
+          <w:rFonts w:eastAsia="Calibri" w:cs="Calibri" w:ascii="Calibri" w:hAnsi="Calibri"/>
+          <w:b w:val="false"/>
+          <w:bCs w:val="false"/>
+          <w:i/>
+          <w:sz w:val="20"/>
+          <w:szCs w:val="20"/>
+        </w:rPr>
+        <w:t>Install</w:t>
+      </w:r>
+      <w:r>
+        <w:rPr>
+          <w:rFonts w:eastAsia="Calibri" w:cs="Calibri" w:ascii="Calibri" w:hAnsi="Calibri"/>
+          <w:b w:val="false"/>
+          <w:bCs w:val="false"/>
+          <w:i/>
+          <w:sz w:val="20"/>
+          <w:szCs w:val="20"/>
+        </w:rPr>
+        <w:t xml:space="preserve"> the python library from the page: milkyway-plot.readthedocs.io </w:t>
+      </w:r>
+      <w:r>
+        <w:rPr>
+          <w:rFonts w:eastAsia="Calibri" w:cs="Calibri" w:ascii="Calibri" w:hAnsi="Calibri"/>
+          <w:b w:val="false"/>
+          <w:bCs w:val="false"/>
+          <w:i/>
+          <w:sz w:val="20"/>
+          <w:szCs w:val="20"/>
+        </w:rPr>
+        <w:t>[5]</w:t>
+      </w:r>
+    </w:p>
+    <w:p>
+      <w:pPr>
+        <w:pStyle w:val="normal1"/>
+        <w:spacing w:lineRule="auto" w:line="240" w:before="240" w:after="240"/>
+        <w:rPr>
+          <w:rFonts w:ascii="Calibri" w:hAnsi="Calibri" w:eastAsia="Calibri" w:cs="Calibri"/>
+          <w:i/>
+          <w:i/>
+          <w:sz w:val="21"/>
+          <w:szCs w:val="21"/>
+        </w:rPr>
+      </w:pPr>
+      <w:r>
+        <w:rPr>
+          <w:rFonts w:eastAsia="Calibri" w:cs="Calibri" w:ascii="Calibri" w:hAnsi="Calibri"/>
+          <w:b w:val="false"/>
+          <w:bCs w:val="false"/>
+          <w:i/>
+          <w:sz w:val="21"/>
+          <w:szCs w:val="21"/>
+        </w:rPr>
+        <w:t xml:space="preserve">(from a jupyter notebook, run in a cell !pip </w:t>
+      </w:r>
+      <w:r>
+        <w:rPr>
+          <w:rFonts w:eastAsia="Calibri" w:cs="Calibri" w:ascii="Calibri" w:hAnsi="Calibri"/>
+          <w:i/>
+          <w:sz w:val="21"/>
+          <w:szCs w:val="21"/>
+        </w:rPr>
+        <w:t xml:space="preserve"> install mw_plot  Use a python environment! Ask the Tas in case of doubts)</w:t>
+      </w:r>
+    </w:p>
+    <w:p>
+      <w:pPr>
+        <w:pStyle w:val="normal1"/>
+        <w:spacing w:lineRule="auto" w:line="240" w:before="240" w:after="240"/>
+        <w:rPr>
+          <w:rFonts w:ascii="Calibri" w:hAnsi="Calibri" w:eastAsia="Calibri" w:cs="Calibri"/>
+          <w:i/>
+          <w:i/>
+          <w:sz w:val="20"/>
+          <w:szCs w:val="20"/>
+        </w:rPr>
+      </w:pPr>
+      <w:r>
+        <w:rPr>
+          <w:rFonts w:eastAsia="Calibri" w:cs="Calibri" w:ascii="Calibri" w:hAnsi="Calibri"/>
+          <w:i/>
+          <w:sz w:val="20"/>
+          <w:szCs w:val="20"/>
+        </w:rPr>
         <w:t xml:space="preserve">Task 1: </w:t>
       </w:r>
       <w:r>
@@ -291,16 +462,1702 @@
           <w:sz w:val="20"/>
           <w:szCs w:val="20"/>
         </w:rPr>
-        <w:t>Reproduce the image of the milky way via MWSkyMap (see attached code)</w:t>
-      </w:r>
-      <w:r>
-        <w:rPr>
-          <w:rFonts w:eastAsia="Calibri" w:cs="Calibri" w:ascii="Calibri" w:hAnsi="Calibri"/>
-          <w:i/>
-          <w:sz w:val="20"/>
-          <w:szCs w:val="20"/>
-        </w:rPr>
-        <w:t>. [</w:t>
+        <w:t>Install the git package and r</w:t>
+      </w:r>
+      <w:r>
+        <w:rPr>
+          <w:rFonts w:eastAsia="Calibri" w:cs="Calibri" w:ascii="Calibri" w:hAnsi="Calibri"/>
+          <w:i/>
+          <w:sz w:val="20"/>
+          <w:szCs w:val="20"/>
+        </w:rPr>
+        <w:t>eproduce the image of the milky way via MWSkyMap (see attached code). [5]</w:t>
+      </w:r>
+    </w:p>
+    <w:p>
+      <w:pPr>
+        <w:pStyle w:val="normal1"/>
+        <w:spacing w:lineRule="auto" w:line="240" w:before="240" w:after="240"/>
+        <w:rPr>
+          <w:rFonts w:ascii="Calibri" w:hAnsi="Calibri" w:eastAsia="Calibri" w:cs="Calibri"/>
+          <w:i/>
+          <w:i/>
+          <w:sz w:val="20"/>
+          <w:szCs w:val="20"/>
+        </w:rPr>
+      </w:pPr>
+      <w:r>
+        <w:rPr>
+          <w:rFonts w:eastAsia="Calibri" w:cs="Calibri" w:ascii="Calibri" w:hAnsi="Calibri"/>
+          <w:i/>
+          <w:sz w:val="20"/>
+          <w:szCs w:val="20"/>
+        </w:rPr>
+        <w:t xml:space="preserve">Task 2: Generate a </w:t>
+      </w:r>
+      <w:r>
+        <w:rPr>
+          <w:rFonts w:eastAsia="Calibri" w:cs="Calibri" w:ascii="Calibri" w:hAnsi="Calibri"/>
+          <w:i/>
+          <w:sz w:val="20"/>
+          <w:szCs w:val="20"/>
+        </w:rPr>
+        <w:t xml:space="preserve">few (at least three in total) </w:t>
+      </w:r>
+      <w:r>
+        <w:rPr>
+          <w:rFonts w:eastAsia="Calibri" w:cs="Calibri" w:ascii="Calibri" w:hAnsi="Calibri"/>
+          <w:i/>
+          <w:sz w:val="20"/>
+          <w:szCs w:val="20"/>
+        </w:rPr>
+        <w:t>visualization</w:t>
+      </w:r>
+      <w:r>
+        <w:rPr>
+          <w:rFonts w:eastAsia="Calibri" w:cs="Calibri" w:ascii="Calibri" w:hAnsi="Calibri"/>
+          <w:i/>
+          <w:sz w:val="20"/>
+          <w:szCs w:val="20"/>
+        </w:rPr>
+        <w:t>s</w:t>
+      </w:r>
+      <w:r>
+        <w:rPr>
+          <w:rFonts w:eastAsia="Calibri" w:cs="Calibri" w:ascii="Calibri" w:hAnsi="Calibri"/>
+          <w:i/>
+          <w:sz w:val="20"/>
+          <w:szCs w:val="20"/>
+        </w:rPr>
+        <w:t xml:space="preserve"> of the milky way sector starting in </w:t>
+      </w:r>
+      <w:r>
+        <w:rPr>
+          <w:rFonts w:eastAsia="Calibri" w:cs="Calibri" w:ascii="Calibri" w:hAnsi="Calibri"/>
+          <w:i/>
+          <w:sz w:val="20"/>
+          <w:szCs w:val="20"/>
+        </w:rPr>
+        <w:t>different</w:t>
+      </w:r>
+      <w:r>
+        <w:rPr>
+          <w:rFonts w:eastAsia="Calibri" w:cs="Calibri" w:ascii="Calibri" w:hAnsi="Calibri"/>
+          <w:i/>
+          <w:sz w:val="20"/>
+          <w:szCs w:val="20"/>
+        </w:rPr>
+        <w:t xml:space="preserve"> </w:t>
+      </w:r>
+      <w:r>
+        <w:rPr>
+          <w:rFonts w:eastAsia="Calibri" w:cs="Calibri" w:ascii="Calibri" w:hAnsi="Calibri"/>
+          <w:b/>
+          <w:bCs/>
+          <w:i/>
+          <w:sz w:val="20"/>
+          <w:szCs w:val="20"/>
+        </w:rPr>
+        <w:t>center</w:t>
+      </w:r>
+      <w:r>
+        <w:rPr>
+          <w:rFonts w:eastAsia="Calibri" w:cs="Calibri" w:ascii="Calibri" w:hAnsi="Calibri"/>
+          <w:b/>
+          <w:bCs/>
+          <w:i/>
+          <w:sz w:val="20"/>
+          <w:szCs w:val="20"/>
+        </w:rPr>
+        <w:t>s</w:t>
+      </w:r>
+      <w:r>
+        <w:rPr>
+          <w:rFonts w:eastAsia="Calibri" w:cs="Calibri" w:ascii="Calibri" w:hAnsi="Calibri"/>
+          <w:i/>
+          <w:sz w:val="20"/>
+          <w:szCs w:val="20"/>
+        </w:rPr>
+        <w:t xml:space="preserve"> (try </w:t>
+      </w:r>
+      <w:r>
+        <w:rPr>
+          <w:rFonts w:eastAsia="Calibri" w:cs="Calibri" w:ascii="Calibri" w:hAnsi="Calibri"/>
+          <w:i/>
+          <w:sz w:val="20"/>
+          <w:szCs w:val="20"/>
+        </w:rPr>
+        <w:t>"M31"</w:t>
+      </w:r>
+      <w:r>
+        <w:rPr>
+          <w:rFonts w:eastAsia="Calibri" w:cs="Calibri" w:ascii="Calibri" w:hAnsi="Calibri"/>
+          <w:i/>
+          <w:sz w:val="20"/>
+          <w:szCs w:val="20"/>
+        </w:rPr>
+        <w:t>) and</w:t>
+      </w:r>
+      <w:r>
+        <w:rPr>
+          <w:rFonts w:eastAsia="Calibri" w:cs="Calibri" w:ascii="Calibri" w:hAnsi="Calibri"/>
+          <w:i/>
+          <w:sz w:val="20"/>
+          <w:szCs w:val="20"/>
+        </w:rPr>
+        <w:t xml:space="preserve"> </w:t>
+      </w:r>
+      <w:r>
+        <w:rPr>
+          <w:rFonts w:eastAsia="Calibri" w:cs="Calibri" w:ascii="Calibri" w:hAnsi="Calibri"/>
+          <w:b/>
+          <w:bCs/>
+          <w:i/>
+          <w:sz w:val="20"/>
+          <w:szCs w:val="20"/>
+        </w:rPr>
+        <w:t xml:space="preserve">with </w:t>
+      </w:r>
+      <w:r>
+        <w:rPr>
+          <w:rFonts w:eastAsia="Calibri" w:cs="Calibri" w:ascii="Calibri" w:hAnsi="Calibri"/>
+          <w:b/>
+          <w:bCs/>
+          <w:i/>
+          <w:sz w:val="20"/>
+          <w:szCs w:val="20"/>
+        </w:rPr>
+        <w:t>different radius</w:t>
+      </w:r>
+      <w:r>
+        <w:rPr>
+          <w:rFonts w:eastAsia="Calibri" w:cs="Calibri" w:ascii="Calibri" w:hAnsi="Calibri"/>
+          <w:i/>
+          <w:sz w:val="20"/>
+          <w:szCs w:val="20"/>
+        </w:rPr>
+        <w:t xml:space="preserve"> (be careful on the units!)</w:t>
+      </w:r>
+      <w:r>
+        <w:rPr>
+          <w:rFonts w:eastAsia="Calibri" w:cs="Calibri" w:ascii="Calibri" w:hAnsi="Calibri"/>
+          <w:i/>
+          <w:sz w:val="20"/>
+          <w:szCs w:val="20"/>
+        </w:rPr>
+        <w:t>. [5]</w:t>
+      </w:r>
+    </w:p>
+    <w:p>
+      <w:pPr>
+        <w:pStyle w:val="normal1"/>
+        <w:spacing w:lineRule="auto" w:line="240" w:before="240" w:after="240"/>
+        <w:rPr>
+          <w:rFonts w:ascii="Calibri" w:hAnsi="Calibri" w:eastAsia="Calibri" w:cs="Calibri"/>
+          <w:i/>
+          <w:i/>
+          <w:sz w:val="20"/>
+          <w:szCs w:val="20"/>
+        </w:rPr>
+      </w:pPr>
+      <w:r>
+        <w:rPr>
+          <w:rFonts w:eastAsia="Calibri" w:cs="Calibri" w:ascii="Calibri" w:hAnsi="Calibri"/>
+          <w:i/>
+          <w:sz w:val="20"/>
+          <w:szCs w:val="20"/>
+        </w:rPr>
+        <w:t>Task 3: Convert the image generated into a rgb np.array (each pixe</w:t>
+      </w:r>
+      <w:r>
+        <w:rPr>
+          <w:rFonts w:eastAsia="Calibri" w:cs="Calibri" w:ascii="Calibri" w:hAnsi="Calibri"/>
+          <w:i/>
+          <w:sz w:val="20"/>
+          <w:szCs w:val="20"/>
+        </w:rPr>
+        <w:t>l</w:t>
+      </w:r>
+      <w:r>
+        <w:rPr>
+          <w:rFonts w:eastAsia="Calibri" w:cs="Calibri" w:ascii="Calibri" w:hAnsi="Calibri"/>
+          <w:i/>
+          <w:sz w:val="20"/>
+          <w:szCs w:val="20"/>
+        </w:rPr>
+        <w:t xml:space="preserve"> will be a list of 3 number, Red, Green, Blue (rbg). [5]</w:t>
+      </w:r>
+    </w:p>
+    <w:p>
+      <w:pPr>
+        <w:pStyle w:val="normal1"/>
+        <w:spacing w:lineRule="auto" w:line="240" w:before="240" w:after="240"/>
+        <w:rPr>
+          <w:rFonts w:ascii="Calibri" w:hAnsi="Calibri" w:eastAsia="Calibri" w:cs="Calibri"/>
+          <w:i/>
+          <w:i/>
+          <w:sz w:val="20"/>
+          <w:szCs w:val="20"/>
+        </w:rPr>
+      </w:pPr>
+      <w:r>
+        <w:rPr>
+          <w:rFonts w:eastAsia="Calibri" w:cs="Calibri" w:ascii="Calibri" w:hAnsi="Calibri"/>
+          <w:i/>
+          <w:sz w:val="20"/>
+          <w:szCs w:val="20"/>
+        </w:rPr>
+        <w:t xml:space="preserve">Task 4: </w:t>
+      </w:r>
+      <w:r>
+        <w:rPr>
+          <w:rFonts w:eastAsia="Calibri" w:cs="Calibri" w:ascii="Calibri" w:hAnsi="Calibri"/>
+          <w:i/>
+          <w:sz w:val="20"/>
+          <w:szCs w:val="20"/>
+        </w:rPr>
+        <w:t>Ideate, describe in words and g</w:t>
+      </w:r>
+      <w:r>
+        <w:rPr>
+          <w:rFonts w:eastAsia="Calibri" w:cs="Calibri" w:ascii="Calibri" w:hAnsi="Calibri"/>
+          <w:i/>
+          <w:sz w:val="20"/>
+          <w:szCs w:val="20"/>
+        </w:rPr>
+        <w:t xml:space="preserve">enerate </w:t>
+      </w:r>
+      <w:r>
+        <w:rPr>
+          <w:rFonts w:eastAsia="Calibri" w:cs="Calibri" w:ascii="Calibri" w:hAnsi="Calibri"/>
+          <w:i/>
+          <w:sz w:val="20"/>
+          <w:szCs w:val="20"/>
+        </w:rPr>
+        <w:t>a set of</w:t>
+      </w:r>
+      <w:r>
+        <w:rPr>
+          <w:rFonts w:eastAsia="Calibri" w:cs="Calibri" w:ascii="Calibri" w:hAnsi="Calibri"/>
+          <w:i/>
+          <w:sz w:val="20"/>
+          <w:szCs w:val="20"/>
+        </w:rPr>
+        <w:t xml:space="preserve"> categor</w:t>
+      </w:r>
+      <w:r>
+        <w:rPr>
+          <w:rFonts w:eastAsia="Calibri" w:cs="Calibri" w:ascii="Calibri" w:hAnsi="Calibri"/>
+          <w:i/>
+          <w:sz w:val="20"/>
+          <w:szCs w:val="20"/>
+        </w:rPr>
+        <w:t>ies</w:t>
+      </w:r>
+      <w:r>
+        <w:rPr>
+          <w:rFonts w:eastAsia="Calibri" w:cs="Calibri" w:ascii="Calibri" w:hAnsi="Calibri"/>
+          <w:i/>
+          <w:sz w:val="20"/>
+          <w:szCs w:val="20"/>
+        </w:rPr>
+        <w:t xml:space="preserve"> from the task 3 data </w:t>
+      </w:r>
+      <w:r>
+        <w:rPr>
+          <w:rFonts w:eastAsia="Calibri" w:cs="Calibri" w:ascii="Calibri" w:hAnsi="Calibri"/>
+          <w:i/>
+          <w:sz w:val="20"/>
+          <w:szCs w:val="20"/>
+        </w:rPr>
+        <w:t xml:space="preserve">(e.g. red? Grey? ). </w:t>
+      </w:r>
+      <w:r>
+        <w:rPr>
+          <w:rFonts w:eastAsia="Calibri" w:cs="Calibri" w:ascii="Calibri" w:hAnsi="Calibri"/>
+          <w:i/>
+          <w:sz w:val="20"/>
+          <w:szCs w:val="20"/>
+        </w:rPr>
+        <w:t xml:space="preserve">This is your </w:t>
+      </w:r>
+      <w:r>
+        <w:rPr>
+          <w:rFonts w:eastAsia="Calibri" w:cs="Calibri" w:ascii="Calibri" w:hAnsi="Calibri"/>
+          <w:b/>
+          <w:bCs/>
+          <w:i/>
+          <w:sz w:val="20"/>
+          <w:szCs w:val="20"/>
+        </w:rPr>
+        <w:t>encoding</w:t>
+      </w:r>
+      <w:r>
+        <w:rPr>
+          <w:rFonts w:eastAsia="Calibri" w:cs="Calibri" w:ascii="Calibri" w:hAnsi="Calibri"/>
+          <w:i/>
+          <w:sz w:val="20"/>
+          <w:szCs w:val="20"/>
+        </w:rPr>
+        <w:t>.</w:t>
+      </w:r>
+      <w:r>
+        <w:rPr>
+          <w:rFonts w:eastAsia="Calibri" w:cs="Calibri" w:ascii="Calibri" w:hAnsi="Calibri"/>
+          <w:i/>
+          <w:sz w:val="20"/>
+          <w:szCs w:val="20"/>
+        </w:rPr>
+        <w:t xml:space="preserve"> </w:t>
+      </w:r>
+      <w:r>
+        <w:rPr>
+          <w:rFonts w:eastAsia="Calibri" w:cs="Calibri" w:ascii="Calibri" w:hAnsi="Calibri"/>
+          <w:i/>
+          <w:sz w:val="20"/>
+          <w:szCs w:val="20"/>
+        </w:rPr>
+        <w:t>[5]</w:t>
+      </w:r>
+    </w:p>
+    <w:p>
+      <w:pPr>
+        <w:pStyle w:val="normal1"/>
+        <w:spacing w:lineRule="auto" w:line="240" w:before="240" w:after="240"/>
+        <w:rPr>
+          <w:rFonts w:ascii="Calibri" w:hAnsi="Calibri" w:eastAsia="Calibri" w:cs="Calibri"/>
+          <w:i/>
+          <w:i/>
+          <w:sz w:val="20"/>
+          <w:szCs w:val="20"/>
+        </w:rPr>
+      </w:pPr>
+      <w:r>
+        <w:rPr>
+          <w:rFonts w:eastAsia="Calibri" w:cs="Calibri" w:ascii="Calibri" w:hAnsi="Calibri"/>
+          <w:i/>
+          <w:sz w:val="20"/>
+          <w:szCs w:val="20"/>
+        </w:rPr>
+        <w:t xml:space="preserve">Task 5: Use K-NN (Nearest neighbor, not discussed in class but extremely simple) or K-means to </w:t>
+      </w:r>
+      <w:r>
+        <w:rPr>
+          <w:rFonts w:eastAsia="Calibri" w:cs="Calibri" w:ascii="Calibri" w:hAnsi="Calibri"/>
+          <w:b/>
+          <w:bCs/>
+          <w:i/>
+          <w:sz w:val="20"/>
+          <w:szCs w:val="20"/>
+        </w:rPr>
+        <w:t>cluster</w:t>
+      </w:r>
+      <w:r>
+        <w:rPr>
+          <w:rFonts w:eastAsia="Calibri" w:cs="Calibri" w:ascii="Calibri" w:hAnsi="Calibri"/>
+          <w:i/>
+          <w:sz w:val="20"/>
+          <w:szCs w:val="20"/>
+        </w:rPr>
+        <w:t xml:space="preserve"> the data [5]</w:t>
+      </w:r>
+    </w:p>
+    <w:p>
+      <w:pPr>
+        <w:pStyle w:val="normal1"/>
+        <w:spacing w:lineRule="auto" w:line="240" w:before="240" w:after="240"/>
+        <w:rPr>
+          <w:rFonts w:ascii="Calibri" w:hAnsi="Calibri" w:eastAsia="Calibri" w:cs="Calibri"/>
+          <w:i/>
+          <w:i/>
+          <w:sz w:val="20"/>
+          <w:szCs w:val="20"/>
+        </w:rPr>
+      </w:pPr>
+      <w:r>
+        <w:rPr>
+          <w:rFonts w:eastAsia="Calibri" w:cs="Calibri" w:ascii="Calibri" w:hAnsi="Calibri"/>
+          <w:i/>
+          <w:sz w:val="20"/>
+          <w:szCs w:val="20"/>
+        </w:rPr>
+        <w:t xml:space="preserve">Task 6: </w:t>
+      </w:r>
+      <w:r>
+        <w:rPr>
+          <w:rFonts w:eastAsia="Calibri" w:cs="Calibri" w:ascii="Calibri" w:hAnsi="Calibri"/>
+          <w:i/>
+          <w:sz w:val="20"/>
+          <w:szCs w:val="20"/>
+        </w:rPr>
+        <w:t>O</w:t>
+      </w:r>
+      <w:r>
+        <w:rPr>
+          <w:rFonts w:eastAsia="Calibri" w:cs="Calibri" w:ascii="Calibri" w:hAnsi="Calibri"/>
+          <w:i/>
+          <w:sz w:val="20"/>
+          <w:szCs w:val="20"/>
+        </w:rPr>
+        <w:t>ver-impose your cluster to the image generate</w:t>
+      </w:r>
+      <w:r>
+        <w:rPr>
+          <w:rFonts w:eastAsia="Calibri" w:cs="Calibri" w:ascii="Calibri" w:hAnsi="Calibri"/>
+          <w:i/>
+          <w:sz w:val="20"/>
+          <w:szCs w:val="20"/>
+        </w:rPr>
+        <w:t>d</w:t>
+      </w:r>
+      <w:r>
+        <w:rPr>
+          <w:rFonts w:eastAsia="Calibri" w:cs="Calibri" w:ascii="Calibri" w:hAnsi="Calibri"/>
+          <w:i/>
+          <w:sz w:val="20"/>
+          <w:szCs w:val="20"/>
+        </w:rPr>
+        <w:t xml:space="preserve"> in task 2 </w:t>
+      </w:r>
+      <w:r>
+        <w:rPr>
+          <w:rFonts w:eastAsia="Calibri" w:cs="Calibri" w:ascii="Calibri" w:hAnsi="Calibri"/>
+          <w:i/>
+          <w:sz w:val="20"/>
+          <w:szCs w:val="20"/>
+        </w:rPr>
+        <w:t>[5]</w:t>
+      </w:r>
+    </w:p>
+    <w:p>
+      <w:pPr>
+        <w:pStyle w:val="normal1"/>
+        <w:spacing w:lineRule="auto" w:line="240" w:before="240" w:after="240"/>
+        <w:rPr>
+          <w:rFonts w:ascii="Calibri" w:hAnsi="Calibri" w:eastAsia="Calibri" w:cs="Calibri"/>
+          <w:i/>
+          <w:i/>
+          <w:sz w:val="20"/>
+          <w:szCs w:val="20"/>
+        </w:rPr>
+      </w:pPr>
+      <w:r>
+        <w:rPr>
+          <w:rFonts w:eastAsia="Calibri" w:cs="Calibri" w:ascii="Calibri" w:hAnsi="Calibri"/>
+          <w:i/>
+          <w:sz w:val="20"/>
+          <w:szCs w:val="20"/>
+        </w:rPr>
+        <w:t xml:space="preserve">Task 7: </w:t>
+      </w:r>
+      <w:r>
+        <w:rPr>
+          <w:rFonts w:eastAsia="Calibri" w:cs="Calibri" w:ascii="Calibri" w:hAnsi="Calibri"/>
+          <w:i/>
+          <w:sz w:val="20"/>
+          <w:szCs w:val="20"/>
+        </w:rPr>
+        <w:t>T</w:t>
+      </w:r>
+      <w:r>
+        <w:rPr>
+          <w:rFonts w:eastAsia="Calibri" w:cs="Calibri" w:ascii="Calibri" w:hAnsi="Calibri"/>
+          <w:i/>
+          <w:sz w:val="20"/>
+          <w:szCs w:val="20"/>
+        </w:rPr>
+        <w:t>ry different categor</w:t>
+      </w:r>
+      <w:r>
+        <w:rPr>
+          <w:rFonts w:eastAsia="Calibri" w:cs="Calibri" w:ascii="Calibri" w:hAnsi="Calibri"/>
+          <w:i/>
+          <w:sz w:val="20"/>
+          <w:szCs w:val="20"/>
+        </w:rPr>
+        <w:t>ies</w:t>
+      </w:r>
+      <w:r>
+        <w:rPr>
+          <w:rFonts w:eastAsia="Calibri" w:cs="Calibri" w:ascii="Calibri" w:hAnsi="Calibri"/>
+          <w:i/>
+          <w:sz w:val="20"/>
+          <w:szCs w:val="20"/>
+        </w:rPr>
+        <w:t xml:space="preserve"> (task 4), repeating tasks 5 and 6, and provide an explanation of your results. What can we learn from a</w:t>
+      </w:r>
+      <w:r>
+        <w:rPr>
+          <w:rFonts w:eastAsia="Calibri" w:cs="Calibri" w:ascii="Calibri" w:hAnsi="Calibri"/>
+          <w:i/>
+          <w:sz w:val="20"/>
+          <w:szCs w:val="20"/>
+        </w:rPr>
+        <w:t>n</w:t>
+      </w:r>
+      <w:r>
+        <w:rPr>
+          <w:rFonts w:eastAsia="Calibri" w:cs="Calibri" w:ascii="Calibri" w:hAnsi="Calibri"/>
+          <w:i/>
+          <w:sz w:val="20"/>
+          <w:szCs w:val="20"/>
+        </w:rPr>
+        <w:t xml:space="preserve"> unsupervised model of our galaxy? </w:t>
+      </w:r>
+      <w:r>
+        <w:rPr>
+          <w:rFonts w:eastAsia="Calibri" w:cs="Calibri" w:ascii="Calibri" w:hAnsi="Calibri"/>
+          <w:i/>
+          <w:sz w:val="20"/>
+          <w:szCs w:val="20"/>
+        </w:rPr>
+        <w:t>[10]</w:t>
+      </w:r>
+    </w:p>
+    <w:p>
+      <w:pPr>
+        <w:pStyle w:val="normal1"/>
+        <w:spacing w:lineRule="auto" w:line="240" w:before="240" w:after="240"/>
+        <w:rPr>
+          <w:rFonts w:ascii="Calibri" w:hAnsi="Calibri" w:eastAsia="Calibri" w:cs="Calibri"/>
+          <w:b/>
+          <w:i/>
+          <w:i/>
+          <w:sz w:val="20"/>
+          <w:szCs w:val="20"/>
+        </w:rPr>
+      </w:pPr>
+      <w:r>
+        <w:rPr>
+          <w:rFonts w:eastAsia="Calibri" w:cs="Calibri" w:ascii="Calibri" w:hAnsi="Calibri"/>
+          <w:b/>
+          <w:i/>
+          <w:sz w:val="20"/>
+          <w:szCs w:val="20"/>
+        </w:rPr>
+      </w:r>
+    </w:p>
+    <w:p>
+      <w:pPr>
+        <w:pStyle w:val="normal1"/>
+        <w:spacing w:lineRule="auto" w:line="240" w:before="240" w:after="240"/>
+        <w:rPr>
+          <w:rFonts w:ascii="Calibri" w:hAnsi="Calibri" w:eastAsia="Calibri" w:cs="Calibri"/>
+          <w:b/>
+          <w:i/>
+          <w:i/>
+          <w:sz w:val="20"/>
+          <w:szCs w:val="20"/>
+        </w:rPr>
+      </w:pPr>
+      <w:r>
+        <w:rPr>
+          <w:rFonts w:eastAsia="Calibri" w:cs="Calibri" w:ascii="Calibri" w:hAnsi="Calibri"/>
+          <w:b/>
+          <w:i/>
+          <w:sz w:val="20"/>
+          <w:szCs w:val="20"/>
+        </w:rPr>
+      </w:r>
+    </w:p>
+    <w:p>
+      <w:pPr>
+        <w:pStyle w:val="normal1"/>
+        <w:spacing w:lineRule="auto" w:line="240" w:before="240" w:after="240"/>
+        <w:rPr>
+          <w:rFonts w:ascii="Calibri" w:hAnsi="Calibri" w:eastAsia="Calibri" w:cs="Calibri"/>
+          <w:b/>
+          <w:i/>
+          <w:i/>
+          <w:sz w:val="20"/>
+          <w:szCs w:val="20"/>
+        </w:rPr>
+      </w:pPr>
+      <w:r>
+        <w:rPr>
+          <w:rFonts w:eastAsia="Calibri" w:cs="Calibri" w:ascii="Calibri" w:hAnsi="Calibri"/>
+          <w:b/>
+          <w:i/>
+          <w:sz w:val="20"/>
+          <w:szCs w:val="20"/>
+        </w:rPr>
+        <w:t>TIPS:</w:t>
+      </w:r>
+    </w:p>
+    <w:p>
+      <w:pPr>
+        <w:pStyle w:val="normal1"/>
+        <w:spacing w:lineRule="auto" w:line="240" w:before="240" w:after="240"/>
+        <w:rPr>
+          <w:rFonts w:ascii="Calibri" w:hAnsi="Calibri" w:eastAsia="Calibri" w:cs="Calibri"/>
+          <w:b w:val="false"/>
+          <w:bCs w:val="false"/>
+          <w:i/>
+          <w:i/>
+          <w:sz w:val="20"/>
+          <w:szCs w:val="20"/>
+        </w:rPr>
+      </w:pPr>
+      <w:r>
+        <w:rPr>
+          <w:rFonts w:eastAsia="Calibri" w:cs="Calibri" w:ascii="Calibri" w:hAnsi="Calibri"/>
+          <w:b w:val="false"/>
+          <w:bCs w:val="false"/>
+          <w:i/>
+          <w:sz w:val="20"/>
+          <w:szCs w:val="20"/>
+        </w:rPr>
+        <w:t xml:space="preserve">Here you will really benefit to </w:t>
+      </w:r>
+      <w:r>
+        <w:rPr>
+          <w:rFonts w:eastAsia="Calibri" w:cs="Calibri" w:ascii="Calibri" w:hAnsi="Calibri"/>
+          <w:b w:val="false"/>
+          <w:bCs w:val="false"/>
+          <w:i/>
+          <w:sz w:val="20"/>
+          <w:szCs w:val="20"/>
+        </w:rPr>
+        <w:t xml:space="preserve">construct a set of </w:t>
+      </w:r>
+      <w:r>
+        <w:rPr>
+          <w:rFonts w:eastAsia="Calibri" w:cs="Calibri" w:ascii="Calibri" w:hAnsi="Calibri"/>
+          <w:b w:val="false"/>
+          <w:bCs w:val="false"/>
+          <w:i/>
+          <w:sz w:val="20"/>
+          <w:szCs w:val="20"/>
+        </w:rPr>
+        <w:t xml:space="preserve">functions that can be re-used over and over again. Once done, you can </w:t>
+      </w:r>
+      <w:r>
+        <w:rPr>
+          <w:rFonts w:eastAsia="Calibri" w:cs="Calibri" w:ascii="Calibri" w:hAnsi="Calibri"/>
+          <w:b w:val="false"/>
+          <w:bCs w:val="false"/>
+          <w:i/>
+          <w:sz w:val="20"/>
+          <w:szCs w:val="20"/>
+        </w:rPr>
+        <w:t xml:space="preserve">promptly </w:t>
+      </w:r>
+      <w:r>
+        <w:rPr>
+          <w:rFonts w:eastAsia="Calibri" w:cs="Calibri" w:ascii="Calibri" w:hAnsi="Calibri"/>
+          <w:b w:val="false"/>
+          <w:bCs w:val="false"/>
+          <w:i/>
+          <w:sz w:val="20"/>
+          <w:szCs w:val="20"/>
+        </w:rPr>
+        <w:t>chang</w:t>
+      </w:r>
+      <w:r>
+        <w:rPr>
+          <w:rFonts w:eastAsia="Calibri" w:cs="Calibri" w:ascii="Calibri" w:hAnsi="Calibri"/>
+          <w:b w:val="false"/>
+          <w:bCs w:val="false"/>
+          <w:i/>
+          <w:sz w:val="20"/>
+          <w:szCs w:val="20"/>
+        </w:rPr>
+        <w:t>e</w:t>
+      </w:r>
+      <w:r>
+        <w:rPr>
+          <w:rFonts w:eastAsia="Calibri" w:cs="Calibri" w:ascii="Calibri" w:hAnsi="Calibri"/>
+          <w:b w:val="false"/>
+          <w:bCs w:val="false"/>
+          <w:i/>
+          <w:sz w:val="20"/>
+          <w:szCs w:val="20"/>
+        </w:rPr>
+        <w:t xml:space="preserve"> the </w:t>
+      </w:r>
+      <w:r>
+        <w:rPr>
+          <w:rFonts w:eastAsia="Calibri" w:cs="Calibri" w:ascii="Calibri" w:hAnsi="Calibri"/>
+          <w:b/>
+          <w:bCs/>
+          <w:i/>
+          <w:sz w:val="20"/>
+          <w:szCs w:val="20"/>
+        </w:rPr>
+        <w:t>centers</w:t>
+      </w:r>
+      <w:r>
+        <w:rPr>
+          <w:rFonts w:eastAsia="Calibri" w:cs="Calibri" w:ascii="Calibri" w:hAnsi="Calibri"/>
+          <w:b w:val="false"/>
+          <w:bCs w:val="false"/>
+          <w:i/>
+          <w:sz w:val="20"/>
+          <w:szCs w:val="20"/>
+        </w:rPr>
+        <w:t xml:space="preserve"> and the </w:t>
+      </w:r>
+      <w:r>
+        <w:rPr>
+          <w:rFonts w:eastAsia="Calibri" w:cs="Calibri" w:ascii="Calibri" w:hAnsi="Calibri"/>
+          <w:b/>
+          <w:bCs/>
+          <w:i/>
+          <w:sz w:val="20"/>
+          <w:szCs w:val="20"/>
+        </w:rPr>
+        <w:t>radius</w:t>
+      </w:r>
+      <w:r>
+        <w:rPr>
+          <w:rFonts w:eastAsia="Calibri" w:cs="Calibri" w:ascii="Calibri" w:hAnsi="Calibri"/>
+          <w:b w:val="false"/>
+          <w:bCs w:val="false"/>
+          <w:i/>
+          <w:sz w:val="20"/>
+          <w:szCs w:val="20"/>
+        </w:rPr>
+        <w:t xml:space="preserve"> of the observation window, </w:t>
+      </w:r>
+      <w:r>
+        <w:rPr>
+          <w:rFonts w:eastAsia="Calibri" w:cs="Calibri" w:ascii="Calibri" w:hAnsi="Calibri"/>
+          <w:b w:val="false"/>
+          <w:bCs w:val="false"/>
+          <w:i/>
+          <w:sz w:val="20"/>
+          <w:szCs w:val="20"/>
+        </w:rPr>
+        <w:t xml:space="preserve">select the </w:t>
+      </w:r>
+      <w:r>
+        <w:rPr>
+          <w:rFonts w:eastAsia="Calibri" w:cs="Calibri" w:ascii="Calibri" w:hAnsi="Calibri"/>
+          <w:b/>
+          <w:bCs/>
+          <w:i/>
+          <w:sz w:val="20"/>
+          <w:szCs w:val="20"/>
+        </w:rPr>
+        <w:t>encoding</w:t>
+      </w:r>
+      <w:r>
+        <w:rPr>
+          <w:rFonts w:eastAsia="Calibri" w:cs="Calibri" w:ascii="Calibri" w:hAnsi="Calibri"/>
+          <w:b w:val="false"/>
+          <w:bCs w:val="false"/>
+          <w:i/>
+          <w:sz w:val="20"/>
+          <w:szCs w:val="20"/>
+        </w:rPr>
+        <w:t xml:space="preserve">, </w:t>
+      </w:r>
+      <w:r>
+        <w:rPr>
+          <w:rFonts w:eastAsia="Calibri" w:cs="Calibri" w:ascii="Calibri" w:hAnsi="Calibri"/>
+          <w:b w:val="false"/>
+          <w:bCs w:val="false"/>
+          <w:i/>
+          <w:sz w:val="20"/>
+          <w:szCs w:val="20"/>
+        </w:rPr>
+        <w:t xml:space="preserve">perform </w:t>
+      </w:r>
+      <w:r>
+        <w:rPr>
+          <w:rFonts w:eastAsia="Calibri" w:cs="Calibri" w:ascii="Calibri" w:hAnsi="Calibri"/>
+          <w:b/>
+          <w:bCs/>
+          <w:i/>
+          <w:sz w:val="20"/>
+          <w:szCs w:val="20"/>
+        </w:rPr>
+        <w:t>clustering</w:t>
+      </w:r>
+      <w:r>
+        <w:rPr>
+          <w:rFonts w:eastAsia="Calibri" w:cs="Calibri" w:ascii="Calibri" w:hAnsi="Calibri"/>
+          <w:b w:val="false"/>
+          <w:bCs w:val="false"/>
+          <w:i/>
+          <w:sz w:val="20"/>
+          <w:szCs w:val="20"/>
+        </w:rPr>
+        <w:t>. In the discussion part, remember the limit of unsupervised approaches.</w:t>
+      </w:r>
+    </w:p>
+    <w:p>
+      <w:pPr>
+        <w:pStyle w:val="normal1"/>
+        <w:spacing w:lineRule="auto" w:line="240" w:before="240" w:after="240"/>
+        <w:rPr>
+          <w:rFonts w:ascii="Calibri" w:hAnsi="Calibri" w:eastAsia="Calibri" w:cs="Calibri"/>
+          <w:b w:val="false"/>
+          <w:i/>
+          <w:i/>
+          <w:sz w:val="20"/>
+          <w:szCs w:val="20"/>
+        </w:rPr>
+      </w:pPr>
+      <w:r>
+        <w:rPr>
+          <w:rFonts w:eastAsia="Calibri" w:cs="Calibri" w:ascii="Calibri" w:hAnsi="Calibri"/>
+          <w:b w:val="false"/>
+          <w:bCs w:val="false"/>
+          <w:i/>
+          <w:sz w:val="20"/>
+          <w:szCs w:val="20"/>
+        </w:rPr>
+        <w:t xml:space="preserve">I made a quick-and-dirty jupyter notebook for you to exemplify the more technical data handling part. </w:t>
+      </w:r>
+      <w:r>
+        <w:rPr>
+          <w:rFonts w:eastAsia="Calibri" w:cs="Calibri" w:ascii="Calibri" w:hAnsi="Calibri"/>
+          <w:b w:val="false"/>
+          <w:bCs w:val="false"/>
+          <w:i/>
+          <w:sz w:val="20"/>
+          <w:szCs w:val="20"/>
+        </w:rPr>
+        <w:t>I just generated one encoding, you have thus an example of pipeline to connect to the notebook I shared in class. The idea is for you to</w:t>
+      </w:r>
+      <w:r>
+        <w:rPr>
+          <w:rFonts w:eastAsia="Calibri" w:cs="Calibri" w:ascii="Calibri" w:hAnsi="Calibri"/>
+          <w:b w:val="false"/>
+          <w:bCs w:val="false"/>
+          <w:i/>
+          <w:sz w:val="20"/>
+          <w:szCs w:val="20"/>
+        </w:rPr>
+        <w:t xml:space="preserve"> focus on the method application and results interpretation. </w:t>
+      </w:r>
+    </w:p>
+    <w:p>
+      <w:pPr>
+        <w:pStyle w:val="normal1"/>
+        <w:spacing w:lineRule="auto" w:line="240" w:before="240" w:after="240"/>
+        <w:rPr>
+          <w:rFonts w:ascii="Calibri" w:hAnsi="Calibri" w:eastAsia="Calibri" w:cs="Calibri"/>
+          <w:b/>
+          <w:i/>
+          <w:i/>
+          <w:sz w:val="20"/>
+          <w:szCs w:val="20"/>
+        </w:rPr>
+      </w:pPr>
+      <w:r>
+        <w:rPr>
+          <w:rFonts w:eastAsia="Calibri" w:cs="Calibri" w:ascii="Calibri" w:hAnsi="Calibri"/>
+          <w:b/>
+          <w:i/>
+          <w:sz w:val="20"/>
+          <w:szCs w:val="20"/>
+        </w:rPr>
+      </w:r>
+    </w:p>
+    <w:p>
+      <w:pPr>
+        <w:pStyle w:val="normal1"/>
+        <w:spacing w:lineRule="auto" w:line="240" w:before="240" w:after="240"/>
+        <w:rPr>
+          <w:rFonts w:ascii="Calibri" w:hAnsi="Calibri" w:eastAsia="Calibri" w:cs="Calibri"/>
+          <w:b/>
+          <w:i/>
+          <w:i/>
+          <w:sz w:val="20"/>
+          <w:szCs w:val="20"/>
+        </w:rPr>
+      </w:pPr>
+      <w:r>
+        <w:rPr>
+          <w:rFonts w:eastAsia="Calibri" w:cs="Calibri" w:ascii="Calibri" w:hAnsi="Calibri"/>
+          <w:b/>
+          <w:i/>
+          <w:sz w:val="20"/>
+          <w:szCs w:val="20"/>
+        </w:rPr>
+      </w:r>
+    </w:p>
+    <w:p>
+      <w:pPr>
+        <w:pStyle w:val="normal1"/>
+        <w:spacing w:lineRule="auto" w:line="240" w:before="240" w:after="240"/>
+        <w:rPr>
+          <w:rFonts w:ascii="Calibri" w:hAnsi="Calibri" w:eastAsia="Calibri" w:cs="Calibri"/>
+          <w:b/>
+          <w:i/>
+          <w:i/>
+          <w:sz w:val="20"/>
+          <w:szCs w:val="20"/>
+        </w:rPr>
+      </w:pPr>
+      <w:r>
+        <w:rPr>
+          <w:rFonts w:eastAsia="Calibri" w:cs="Calibri" w:ascii="Calibri" w:hAnsi="Calibri"/>
+          <w:b/>
+          <w:i/>
+          <w:sz w:val="20"/>
+          <w:szCs w:val="20"/>
+        </w:rPr>
+      </w:r>
+    </w:p>
+    <w:p>
+      <w:pPr>
+        <w:pStyle w:val="normal1"/>
+        <w:spacing w:lineRule="auto" w:line="240" w:before="240" w:after="240"/>
+        <w:rPr>
+          <w:rFonts w:ascii="Calibri" w:hAnsi="Calibri" w:eastAsia="Calibri" w:cs="Calibri"/>
+          <w:b/>
+          <w:i/>
+          <w:i/>
+          <w:sz w:val="20"/>
+          <w:szCs w:val="20"/>
+        </w:rPr>
+      </w:pPr>
+      <w:r>
+        <w:rPr>
+          <w:rFonts w:eastAsia="Calibri" w:cs="Calibri" w:ascii="Calibri" w:hAnsi="Calibri"/>
+          <w:b/>
+          <w:i/>
+          <w:sz w:val="20"/>
+          <w:szCs w:val="20"/>
+        </w:rPr>
+      </w:r>
+    </w:p>
+    <w:p>
+      <w:pPr>
+        <w:pStyle w:val="normal1"/>
+        <w:spacing w:lineRule="auto" w:line="240" w:before="240" w:after="240"/>
+        <w:rPr>
+          <w:rFonts w:ascii="Calibri" w:hAnsi="Calibri" w:eastAsia="Calibri" w:cs="Calibri"/>
+          <w:b/>
+          <w:i/>
+          <w:i/>
+          <w:sz w:val="20"/>
+          <w:szCs w:val="20"/>
+        </w:rPr>
+      </w:pPr>
+      <w:r>
+        <w:rPr>
+          <w:rFonts w:eastAsia="Calibri" w:cs="Calibri" w:ascii="Calibri" w:hAnsi="Calibri"/>
+          <w:b/>
+          <w:i/>
+          <w:sz w:val="20"/>
+          <w:szCs w:val="20"/>
+        </w:rPr>
+      </w:r>
+    </w:p>
+    <w:p>
+      <w:pPr>
+        <w:pStyle w:val="normal1"/>
+        <w:spacing w:lineRule="auto" w:line="240" w:before="240" w:after="240"/>
+        <w:rPr>
+          <w:rFonts w:ascii="Calibri" w:hAnsi="Calibri" w:eastAsia="Calibri" w:cs="Calibri"/>
+          <w:b/>
+          <w:i/>
+          <w:i/>
+          <w:sz w:val="20"/>
+          <w:szCs w:val="20"/>
+        </w:rPr>
+      </w:pPr>
+      <w:r>
+        <w:rPr>
+          <w:rFonts w:eastAsia="Calibri" w:cs="Calibri" w:ascii="Calibri" w:hAnsi="Calibri"/>
+          <w:b/>
+          <w:i/>
+          <w:sz w:val="20"/>
+          <w:szCs w:val="20"/>
+        </w:rPr>
+      </w:r>
+    </w:p>
+    <w:p>
+      <w:pPr>
+        <w:pStyle w:val="normal1"/>
+        <w:spacing w:lineRule="auto" w:line="240" w:before="240" w:after="240"/>
+        <w:rPr>
+          <w:rFonts w:ascii="Calibri" w:hAnsi="Calibri" w:eastAsia="Calibri" w:cs="Calibri"/>
+          <w:b/>
+          <w:i/>
+          <w:i/>
+          <w:sz w:val="20"/>
+          <w:szCs w:val="20"/>
+        </w:rPr>
+      </w:pPr>
+      <w:r>
+        <w:rPr>
+          <w:rFonts w:eastAsia="Calibri" w:cs="Calibri" w:ascii="Calibri" w:hAnsi="Calibri"/>
+          <w:b/>
+          <w:i/>
+          <w:sz w:val="20"/>
+          <w:szCs w:val="20"/>
+        </w:rPr>
+      </w:r>
+    </w:p>
+    <w:p>
+      <w:pPr>
+        <w:pStyle w:val="normal1"/>
+        <w:spacing w:lineRule="auto" w:line="240" w:before="240" w:after="240"/>
+        <w:rPr>
+          <w:rFonts w:ascii="Calibri" w:hAnsi="Calibri" w:eastAsia="Calibri" w:cs="Calibri"/>
+          <w:b/>
+          <w:i/>
+          <w:i/>
+          <w:sz w:val="20"/>
+          <w:szCs w:val="20"/>
+        </w:rPr>
+      </w:pPr>
+      <w:r>
+        <w:rPr>
+          <w:rFonts w:eastAsia="Calibri" w:cs="Calibri" w:ascii="Calibri" w:hAnsi="Calibri"/>
+          <w:b/>
+          <w:i/>
+          <w:sz w:val="20"/>
+          <w:szCs w:val="20"/>
+        </w:rPr>
+      </w:r>
+    </w:p>
+    <w:p>
+      <w:pPr>
+        <w:pStyle w:val="normal1"/>
+        <w:spacing w:lineRule="auto" w:line="240" w:before="240" w:after="240"/>
+        <w:rPr>
+          <w:rFonts w:ascii="Calibri" w:hAnsi="Calibri" w:eastAsia="Calibri" w:cs="Calibri"/>
+          <w:b/>
+          <w:i/>
+          <w:i/>
+          <w:sz w:val="20"/>
+          <w:szCs w:val="20"/>
+        </w:rPr>
+      </w:pPr>
+      <w:r>
+        <w:rPr>
+          <w:rFonts w:eastAsia="Calibri" w:cs="Calibri" w:ascii="Calibri" w:hAnsi="Calibri"/>
+          <w:b/>
+          <w:i/>
+          <w:sz w:val="20"/>
+          <w:szCs w:val="20"/>
+        </w:rPr>
+      </w:r>
+    </w:p>
+    <w:p>
+      <w:pPr>
+        <w:pStyle w:val="normal1"/>
+        <w:spacing w:lineRule="auto" w:line="240" w:before="240" w:after="240"/>
+        <w:rPr>
+          <w:rFonts w:ascii="Calibri" w:hAnsi="Calibri" w:eastAsia="Calibri" w:cs="Calibri"/>
+          <w:b/>
+          <w:i/>
+          <w:i/>
+          <w:sz w:val="20"/>
+          <w:szCs w:val="20"/>
+        </w:rPr>
+      </w:pPr>
+      <w:r>
+        <w:rPr>
+          <w:rFonts w:eastAsia="Calibri" w:cs="Calibri" w:ascii="Calibri" w:hAnsi="Calibri"/>
+          <w:b/>
+          <w:i/>
+          <w:sz w:val="20"/>
+          <w:szCs w:val="20"/>
+        </w:rPr>
+      </w:r>
+    </w:p>
+    <w:p>
+      <w:pPr>
+        <w:pStyle w:val="normal1"/>
+        <w:spacing w:lineRule="auto" w:line="240" w:before="240" w:after="240"/>
+        <w:rPr>
+          <w:rFonts w:ascii="Calibri" w:hAnsi="Calibri" w:eastAsia="Calibri" w:cs="Calibri"/>
+          <w:b/>
+          <w:i/>
+          <w:i/>
+          <w:sz w:val="20"/>
+          <w:szCs w:val="20"/>
+        </w:rPr>
+      </w:pPr>
+      <w:r>
+        <w:rPr>
+          <w:rFonts w:eastAsia="Calibri" w:cs="Calibri" w:ascii="Calibri" w:hAnsi="Calibri"/>
+          <w:b/>
+          <w:i/>
+          <w:sz w:val="20"/>
+          <w:szCs w:val="20"/>
+        </w:rPr>
+        <w:t xml:space="preserve">TOPIC 2: Supervised learning: Machines versus human models, </w:t>
+      </w:r>
+      <w:r>
+        <w:rPr>
+          <w:rFonts w:eastAsia="Calibri" w:cs="Calibri" w:ascii="Calibri" w:hAnsi="Calibri"/>
+          <w:b/>
+          <w:i/>
+          <w:sz w:val="20"/>
+          <w:szCs w:val="20"/>
+        </w:rPr>
+        <w:t xml:space="preserve">who can save the world?? </w:t>
+      </w:r>
+    </w:p>
+    <w:p>
+      <w:pPr>
+        <w:pStyle w:val="normal1"/>
+        <w:spacing w:lineRule="auto" w:line="240" w:before="240" w:after="240"/>
+        <w:rPr>
+          <w:rFonts w:ascii="Calibri" w:hAnsi="Calibri" w:eastAsia="Calibri" w:cs="Calibri"/>
+          <w:b/>
+          <w:i/>
+          <w:i/>
+          <w:sz w:val="20"/>
+          <w:szCs w:val="20"/>
+        </w:rPr>
+      </w:pPr>
+      <w:r>
+        <w:rPr>
+          <w:rFonts w:eastAsia="Calibri" w:cs="Calibri" w:ascii="Calibri" w:hAnsi="Calibri"/>
+          <w:b/>
+          <w:i/>
+          <w:sz w:val="20"/>
+          <w:szCs w:val="20"/>
+        </w:rPr>
+        <w:drawing>
+          <wp:anchor behindDoc="0" distT="0" distB="0" distL="0" distR="0" simplePos="0" locked="0" layoutInCell="0" allowOverlap="1" relativeHeight="3">
+            <wp:simplePos x="0" y="0"/>
+            <wp:positionH relativeFrom="column">
+              <wp:posOffset>953135</wp:posOffset>
+            </wp:positionH>
+            <wp:positionV relativeFrom="paragraph">
+              <wp:posOffset>67945</wp:posOffset>
+            </wp:positionV>
+            <wp:extent cx="3467100" cy="2311400"/>
+            <wp:effectExtent l="0" t="0" r="0" b="0"/>
+            <wp:wrapSquare wrapText="largest"/>
+            <wp:docPr id="2" name="Image2"/>
+            <wp:cNvGraphicFramePr>
+              <a:graphicFrameLocks xmlns:a="http://schemas.openxmlformats.org/drawingml/2006/main" noChangeAspect="1"/>
+            </wp:cNvGraphicFramePr>
+            <a:graphic xmlns:a="http://schemas.openxmlformats.org/drawingml/2006/main">
+              <a:graphicData uri="http://schemas.openxmlformats.org/drawingml/2006/picture">
+                <pic:pic xmlns:pic="http://schemas.openxmlformats.org/drawingml/2006/picture">
+                  <pic:nvPicPr>
+                    <pic:cNvPr id="2" name="Image2"/>
+                    <pic:cNvPicPr>
+                      <a:picLocks noChangeAspect="1" noChangeArrowheads="1"/>
+                    </pic:cNvPicPr>
+                  </pic:nvPicPr>
+                  <pic:blipFill>
+                    <a:blip r:embed="rId3"/>
+                    <a:stretch>
+                      <a:fillRect/>
+                    </a:stretch>
+                  </pic:blipFill>
+                  <pic:spPr bwMode="auto">
+                    <a:xfrm>
+                      <a:off x="0" y="0"/>
+                      <a:ext cx="3467100" cy="2311400"/>
+                    </a:xfrm>
+                    <a:prstGeom prst="rect">
+                      <a:avLst/>
+                    </a:prstGeom>
+                    <a:noFill/>
+                  </pic:spPr>
+                </pic:pic>
+              </a:graphicData>
+            </a:graphic>
+          </wp:anchor>
+        </w:drawing>
+      </w:r>
+    </w:p>
+    <w:p>
+      <w:pPr>
+        <w:pStyle w:val="normal1"/>
+        <w:spacing w:lineRule="auto" w:line="240" w:before="240" w:after="240"/>
+        <w:rPr>
+          <w:rFonts w:ascii="Calibri" w:hAnsi="Calibri" w:eastAsia="Calibri" w:cs="Calibri"/>
+          <w:b/>
+          <w:i/>
+          <w:i/>
+          <w:sz w:val="20"/>
+          <w:szCs w:val="20"/>
+        </w:rPr>
+      </w:pPr>
+      <w:r>
+        <w:rPr>
+          <w:rFonts w:eastAsia="Calibri" w:cs="Calibri" w:ascii="Calibri" w:hAnsi="Calibri"/>
+          <w:b/>
+          <w:i/>
+          <w:sz w:val="20"/>
+          <w:szCs w:val="20"/>
+        </w:rPr>
+      </w:r>
+    </w:p>
+    <w:p>
+      <w:pPr>
+        <w:pStyle w:val="normal1"/>
+        <w:spacing w:lineRule="auto" w:line="240" w:before="240" w:after="240"/>
+        <w:rPr>
+          <w:rFonts w:ascii="Calibri" w:hAnsi="Calibri" w:eastAsia="Calibri" w:cs="Calibri"/>
+          <w:b/>
+          <w:i/>
+          <w:i/>
+          <w:sz w:val="20"/>
+          <w:szCs w:val="20"/>
+        </w:rPr>
+      </w:pPr>
+      <w:r>
+        <w:rPr>
+          <w:rFonts w:eastAsia="Calibri" w:cs="Calibri" w:ascii="Calibri" w:hAnsi="Calibri"/>
+          <w:b/>
+          <w:i/>
+          <w:sz w:val="20"/>
+          <w:szCs w:val="20"/>
+        </w:rPr>
+      </w:r>
+    </w:p>
+    <w:p>
+      <w:pPr>
+        <w:pStyle w:val="normal1"/>
+        <w:spacing w:lineRule="auto" w:line="240" w:before="240" w:after="240"/>
+        <w:rPr>
+          <w:rFonts w:ascii="Calibri" w:hAnsi="Calibri" w:eastAsia="Calibri" w:cs="Calibri"/>
+          <w:b/>
+          <w:i/>
+          <w:i/>
+          <w:sz w:val="20"/>
+          <w:szCs w:val="20"/>
+        </w:rPr>
+      </w:pPr>
+      <w:r>
+        <w:rPr>
+          <w:rFonts w:eastAsia="Calibri" w:cs="Calibri" w:ascii="Calibri" w:hAnsi="Calibri"/>
+          <w:b/>
+          <w:i/>
+          <w:sz w:val="20"/>
+          <w:szCs w:val="20"/>
+        </w:rPr>
+      </w:r>
+    </w:p>
+    <w:p>
+      <w:pPr>
+        <w:pStyle w:val="normal1"/>
+        <w:spacing w:lineRule="auto" w:line="240" w:before="240" w:after="240"/>
+        <w:rPr>
+          <w:rFonts w:ascii="Calibri" w:hAnsi="Calibri" w:eastAsia="Calibri" w:cs="Calibri"/>
+          <w:b/>
+          <w:i/>
+          <w:i/>
+          <w:sz w:val="20"/>
+          <w:szCs w:val="20"/>
+        </w:rPr>
+      </w:pPr>
+      <w:r>
+        <w:rPr>
+          <w:rFonts w:eastAsia="Calibri" w:cs="Calibri" w:ascii="Calibri" w:hAnsi="Calibri"/>
+          <w:b/>
+          <w:i/>
+          <w:sz w:val="20"/>
+          <w:szCs w:val="20"/>
+        </w:rPr>
+      </w:r>
+    </w:p>
+    <w:p>
+      <w:pPr>
+        <w:pStyle w:val="normal1"/>
+        <w:spacing w:lineRule="auto" w:line="240" w:before="240" w:after="240"/>
+        <w:rPr>
+          <w:rFonts w:ascii="Calibri" w:hAnsi="Calibri" w:eastAsia="Calibri" w:cs="Calibri"/>
+          <w:b/>
+          <w:i/>
+          <w:i/>
+          <w:sz w:val="20"/>
+          <w:szCs w:val="20"/>
+        </w:rPr>
+      </w:pPr>
+      <w:r>
+        <w:rPr>
+          <w:rFonts w:eastAsia="Calibri" w:cs="Calibri" w:ascii="Calibri" w:hAnsi="Calibri"/>
+          <w:b/>
+          <w:i/>
+          <w:sz w:val="20"/>
+          <w:szCs w:val="20"/>
+        </w:rPr>
+      </w:r>
+    </w:p>
+    <w:p>
+      <w:pPr>
+        <w:pStyle w:val="normal1"/>
+        <w:spacing w:lineRule="auto" w:line="240" w:before="240" w:after="240"/>
+        <w:rPr>
+          <w:rFonts w:ascii="Calibri" w:hAnsi="Calibri" w:eastAsia="Calibri" w:cs="Calibri"/>
+          <w:b/>
+          <w:i/>
+          <w:i/>
+          <w:sz w:val="20"/>
+          <w:szCs w:val="20"/>
+        </w:rPr>
+      </w:pPr>
+      <w:r>
+        <w:rPr>
+          <w:rFonts w:eastAsia="Calibri" w:cs="Calibri" w:ascii="Calibri" w:hAnsi="Calibri"/>
+          <w:b/>
+          <w:i/>
+          <w:sz w:val="20"/>
+          <w:szCs w:val="20"/>
+        </w:rPr>
+      </w:r>
+    </w:p>
+    <w:p>
+      <w:pPr>
+        <w:pStyle w:val="normal1"/>
+        <w:spacing w:lineRule="auto" w:line="240" w:before="240" w:after="240"/>
+        <w:rPr>
+          <w:rFonts w:ascii="Calibri" w:hAnsi="Calibri" w:eastAsia="Calibri" w:cs="Calibri"/>
+          <w:b/>
+          <w:i/>
+          <w:i/>
+          <w:sz w:val="20"/>
+          <w:szCs w:val="20"/>
+        </w:rPr>
+      </w:pPr>
+      <w:r>
+        <w:rPr>
+          <w:rFonts w:eastAsia="Calibri" w:cs="Calibri" w:ascii="Calibri" w:hAnsi="Calibri"/>
+          <w:b/>
+          <w:i/>
+          <w:sz w:val="20"/>
+          <w:szCs w:val="20"/>
+        </w:rPr>
+      </w:r>
+    </w:p>
+    <w:p>
+      <w:pPr>
+        <w:pStyle w:val="normal1"/>
+        <w:spacing w:lineRule="auto" w:line="240" w:before="240" w:after="240"/>
+        <w:rPr>
+          <w:rFonts w:ascii="Calibri" w:hAnsi="Calibri" w:eastAsia="Calibri" w:cs="Calibri"/>
+          <w:b/>
+          <w:i/>
+          <w:i/>
+          <w:sz w:val="20"/>
+          <w:szCs w:val="20"/>
+        </w:rPr>
+      </w:pPr>
+      <w:r>
+        <w:rPr>
+          <w:rFonts w:eastAsia="Calibri" w:cs="Calibri" w:ascii="Calibri" w:hAnsi="Calibri"/>
+          <w:b/>
+          <w:i/>
+          <w:sz w:val="20"/>
+          <w:szCs w:val="20"/>
+        </w:rPr>
+      </w:r>
+    </w:p>
+    <w:p>
+      <w:pPr>
+        <w:pStyle w:val="normal1"/>
+        <w:spacing w:lineRule="auto" w:line="240" w:before="240" w:after="240"/>
+        <w:rPr>
+          <w:rFonts w:ascii="Calibri" w:hAnsi="Calibri" w:eastAsia="Calibri" w:cs="Calibri"/>
+          <w:i/>
+          <w:i/>
+          <w:sz w:val="20"/>
+          <w:szCs w:val="20"/>
+        </w:rPr>
+      </w:pPr>
+      <w:r>
+        <w:rPr>
+          <w:rFonts w:eastAsia="Calibri" w:cs="Calibri" w:ascii="Calibri" w:hAnsi="Calibri"/>
+          <w:i/>
+          <w:sz w:val="20"/>
+          <w:szCs w:val="20"/>
+        </w:rPr>
+        <w:t xml:space="preserve">Task </w:t>
+      </w:r>
+      <w:r>
+        <w:rPr>
+          <w:rFonts w:eastAsia="Calibri" w:cs="Calibri" w:ascii="Calibri" w:hAnsi="Calibri"/>
+          <w:i/>
+          <w:sz w:val="20"/>
+          <w:szCs w:val="20"/>
+        </w:rPr>
+        <w:t>0</w:t>
+      </w:r>
+      <w:r>
+        <w:rPr>
+          <w:rFonts w:eastAsia="Calibri" w:cs="Calibri" w:ascii="Calibri" w:hAnsi="Calibri"/>
+          <w:i/>
+          <w:sz w:val="20"/>
+          <w:szCs w:val="20"/>
+        </w:rPr>
+        <w:t xml:space="preserve">: Reproduce the project 2 exercise 5 plots for Ebola epidemic in West Africa (data points and model </w:t>
+      </w:r>
+      <w:r>
+        <w:rPr>
+          <w:rFonts w:eastAsia="Calibri" w:cs="Calibri" w:ascii="Calibri" w:hAnsi="Calibri"/>
+          <w:i/>
+          <w:sz w:val="20"/>
+          <w:szCs w:val="20"/>
+        </w:rPr>
+        <w:t>prediction</w:t>
+      </w:r>
+      <w:r>
+        <w:rPr>
+          <w:rFonts w:eastAsia="Calibri" w:cs="Calibri" w:ascii="Calibri" w:hAnsi="Calibri"/>
+          <w:i/>
+          <w:sz w:val="20"/>
+          <w:szCs w:val="20"/>
+        </w:rPr>
+        <w:t>). If you are not confident from previous results, ask the T</w:t>
+      </w:r>
+      <w:r>
+        <w:rPr>
+          <w:rFonts w:eastAsia="Calibri" w:cs="Calibri" w:ascii="Calibri" w:hAnsi="Calibri"/>
+          <w:i/>
+          <w:sz w:val="20"/>
+          <w:szCs w:val="20"/>
+        </w:rPr>
+        <w:t>A</w:t>
+      </w:r>
+      <w:r>
+        <w:rPr>
+          <w:rFonts w:eastAsia="Calibri" w:cs="Calibri" w:ascii="Calibri" w:hAnsi="Calibri"/>
+          <w:i/>
+          <w:sz w:val="20"/>
+          <w:szCs w:val="20"/>
+        </w:rPr>
+        <w:t xml:space="preserve">s </w:t>
+      </w:r>
+      <w:r>
+        <w:rPr>
+          <w:rFonts w:eastAsia="Calibri" w:cs="Calibri" w:ascii="Calibri" w:hAnsi="Calibri"/>
+          <w:b w:val="false"/>
+          <w:bCs w:val="false"/>
+          <w:i/>
+          <w:sz w:val="20"/>
+          <w:szCs w:val="20"/>
+        </w:rPr>
+        <w:t xml:space="preserve"> (or another group) </w:t>
+      </w:r>
+      <w:r>
+        <w:rPr>
+          <w:rFonts w:eastAsia="Calibri" w:cs="Calibri" w:ascii="Calibri" w:hAnsi="Calibri"/>
+          <w:i/>
+          <w:sz w:val="20"/>
+          <w:szCs w:val="20"/>
+        </w:rPr>
+        <w:t xml:space="preserve"> for the correct solution [5] </w:t>
+      </w:r>
+    </w:p>
+    <w:p>
+      <w:pPr>
+        <w:pStyle w:val="normal1"/>
+        <w:spacing w:lineRule="auto" w:line="240" w:before="240" w:after="240"/>
+        <w:rPr>
+          <w:rFonts w:ascii="Calibri" w:hAnsi="Calibri" w:eastAsia="Calibri" w:cs="Calibri"/>
+          <w:i/>
+          <w:i/>
+          <w:sz w:val="20"/>
+          <w:szCs w:val="20"/>
+        </w:rPr>
+      </w:pPr>
+      <w:r>
+        <w:rPr>
+          <w:rFonts w:eastAsia="Calibri" w:cs="Calibri" w:ascii="Calibri" w:hAnsi="Calibri"/>
+          <w:i/>
+          <w:sz w:val="20"/>
+          <w:szCs w:val="20"/>
+        </w:rPr>
+        <w:t xml:space="preserve">Task </w:t>
+      </w:r>
+      <w:r>
+        <w:rPr>
+          <w:rFonts w:eastAsia="Calibri" w:cs="Calibri" w:ascii="Calibri" w:hAnsi="Calibri"/>
+          <w:i/>
+          <w:sz w:val="20"/>
+          <w:szCs w:val="20"/>
+        </w:rPr>
+        <w:t>1</w:t>
+      </w:r>
+      <w:r>
+        <w:rPr>
+          <w:rFonts w:eastAsia="Calibri" w:cs="Calibri" w:ascii="Calibri" w:hAnsi="Calibri"/>
+          <w:i/>
+          <w:sz w:val="20"/>
+          <w:szCs w:val="20"/>
+        </w:rPr>
+        <w:t>: Train a line with linear regression on the data for the three countries. [5]</w:t>
+      </w:r>
+    </w:p>
+    <w:p>
+      <w:pPr>
+        <w:pStyle w:val="normal1"/>
+        <w:spacing w:lineRule="auto" w:line="240" w:before="240" w:after="240"/>
+        <w:rPr>
+          <w:rFonts w:ascii="Calibri" w:hAnsi="Calibri" w:eastAsia="Calibri" w:cs="Calibri"/>
+          <w:i/>
+          <w:i/>
+          <w:sz w:val="20"/>
+          <w:szCs w:val="20"/>
+        </w:rPr>
+      </w:pPr>
+      <w:r>
+        <w:rPr>
+          <w:rFonts w:eastAsia="Calibri" w:cs="Calibri" w:ascii="Calibri" w:hAnsi="Calibri"/>
+          <w:i/>
+          <w:sz w:val="20"/>
+          <w:szCs w:val="20"/>
+        </w:rPr>
+        <w:t xml:space="preserve">Task </w:t>
+      </w:r>
+      <w:r>
+        <w:rPr>
+          <w:rFonts w:eastAsia="Calibri" w:cs="Calibri" w:ascii="Calibri" w:hAnsi="Calibri"/>
+          <w:i/>
+          <w:sz w:val="20"/>
+          <w:szCs w:val="20"/>
+        </w:rPr>
+        <w:t>2</w:t>
+      </w:r>
+      <w:r>
+        <w:rPr>
+          <w:rFonts w:eastAsia="Calibri" w:cs="Calibri" w:ascii="Calibri" w:hAnsi="Calibri"/>
+          <w:i/>
+          <w:sz w:val="20"/>
+          <w:szCs w:val="20"/>
+        </w:rPr>
+        <w:t>: Train a better fitting function than a single line with linear regression on the data for the three countries. [</w:t>
+      </w:r>
+      <w:r>
+        <w:rPr>
+          <w:rFonts w:eastAsia="Calibri" w:cs="Calibri" w:ascii="Calibri" w:hAnsi="Calibri"/>
+          <w:i/>
+          <w:sz w:val="20"/>
+          <w:szCs w:val="20"/>
+        </w:rPr>
+        <w:t>10</w:t>
+      </w:r>
+      <w:r>
+        <w:rPr>
+          <w:rFonts w:eastAsia="Calibri" w:cs="Calibri" w:ascii="Calibri" w:hAnsi="Calibri"/>
+          <w:i/>
+          <w:sz w:val="20"/>
+          <w:szCs w:val="20"/>
+        </w:rPr>
+        <w:t>]</w:t>
+      </w:r>
+    </w:p>
+    <w:p>
+      <w:pPr>
+        <w:pStyle w:val="normal1"/>
+        <w:spacing w:lineRule="auto" w:line="240" w:before="240" w:after="240"/>
+        <w:rPr>
+          <w:rFonts w:ascii="Calibri" w:hAnsi="Calibri" w:eastAsia="Calibri" w:cs="Calibri"/>
+          <w:i/>
+          <w:i/>
+          <w:sz w:val="20"/>
+          <w:szCs w:val="20"/>
+        </w:rPr>
+      </w:pPr>
+      <w:r>
+        <w:rPr>
+          <w:rFonts w:eastAsia="Calibri" w:cs="Calibri" w:ascii="Calibri" w:hAnsi="Calibri"/>
+          <w:i/>
+          <w:sz w:val="20"/>
+          <w:szCs w:val="20"/>
+        </w:rPr>
+        <w:t xml:space="preserve">Task </w:t>
+      </w:r>
+      <w:r>
+        <w:rPr>
+          <w:rFonts w:eastAsia="Calibri" w:cs="Calibri" w:ascii="Calibri" w:hAnsi="Calibri"/>
+          <w:i/>
+          <w:sz w:val="20"/>
+          <w:szCs w:val="20"/>
+        </w:rPr>
+        <w:t>3</w:t>
+      </w:r>
+      <w:r>
+        <w:rPr>
+          <w:rFonts w:eastAsia="Calibri" w:cs="Calibri" w:ascii="Calibri" w:hAnsi="Calibri"/>
+          <w:i/>
+          <w:sz w:val="20"/>
+          <w:szCs w:val="20"/>
+        </w:rPr>
+        <w:t xml:space="preserve">: Train a NN network and predict the epidemic evolution. </w:t>
+      </w:r>
+      <w:r>
+        <w:rPr>
+          <w:rFonts w:eastAsia="Calibri" w:cs="Calibri" w:ascii="Calibri" w:hAnsi="Calibri"/>
+          <w:i/>
+          <w:sz w:val="20"/>
+          <w:szCs w:val="20"/>
+        </w:rPr>
+        <w:t>Careful here in your training/test split, remember the assumptions you need to take here.</w:t>
+      </w:r>
+      <w:r>
+        <w:rPr>
+          <w:rFonts w:eastAsia="Calibri" w:cs="Calibri" w:ascii="Calibri" w:hAnsi="Calibri"/>
+          <w:i/>
+          <w:sz w:val="20"/>
+          <w:szCs w:val="20"/>
+        </w:rPr>
+        <w:t xml:space="preserve"> [10]</w:t>
+      </w:r>
+    </w:p>
+    <w:p>
+      <w:pPr>
+        <w:pStyle w:val="normal1"/>
+        <w:spacing w:lineRule="auto" w:line="240" w:before="240" w:after="240"/>
+        <w:rPr>
+          <w:rFonts w:ascii="Calibri" w:hAnsi="Calibri" w:eastAsia="Calibri" w:cs="Calibri"/>
+          <w:i/>
+          <w:i/>
+          <w:sz w:val="20"/>
+          <w:szCs w:val="20"/>
+        </w:rPr>
+      </w:pPr>
+      <w:r>
+        <w:rPr>
+          <w:rFonts w:eastAsia="Calibri" w:cs="Calibri" w:ascii="Calibri" w:hAnsi="Calibri"/>
+          <w:i/>
+          <w:sz w:val="20"/>
+          <w:szCs w:val="20"/>
+        </w:rPr>
+        <w:t xml:space="preserve">Task </w:t>
+      </w:r>
+      <w:r>
+        <w:rPr>
+          <w:rFonts w:eastAsia="Calibri" w:cs="Calibri" w:ascii="Calibri" w:hAnsi="Calibri"/>
+          <w:i/>
+          <w:sz w:val="20"/>
+          <w:szCs w:val="20"/>
+        </w:rPr>
+        <w:t>4</w:t>
+      </w:r>
+      <w:r>
+        <w:rPr>
+          <w:rFonts w:eastAsia="Calibri" w:cs="Calibri" w:ascii="Calibri" w:hAnsi="Calibri"/>
+          <w:i/>
+          <w:sz w:val="20"/>
+          <w:szCs w:val="20"/>
+        </w:rPr>
+        <w:t xml:space="preserve">: Train a LSTM </w:t>
+      </w:r>
+      <w:r>
+        <w:rPr>
+          <w:rFonts w:eastAsia="Calibri" w:cs="Calibri" w:ascii="Calibri" w:hAnsi="Calibri"/>
+          <w:i/>
+          <w:sz w:val="20"/>
+          <w:szCs w:val="20"/>
+        </w:rPr>
+        <w:t xml:space="preserve">(a NN specialized for time series) </w:t>
+      </w:r>
+      <w:r>
+        <w:rPr>
+          <w:rFonts w:eastAsia="Calibri" w:cs="Calibri" w:ascii="Calibri" w:hAnsi="Calibri"/>
+          <w:i/>
+          <w:sz w:val="20"/>
+          <w:szCs w:val="20"/>
+        </w:rPr>
+        <w:t>and predict the epidemic evolution. [1</w:t>
       </w:r>
       <w:r>
         <w:rPr>
@@ -318,6 +2175,132 @@
           <w:sz w:val="20"/>
           <w:szCs w:val="20"/>
         </w:rPr>
+        <w:t xml:space="preserve">] </w:t>
+      </w:r>
+      <w:r>
+        <w:rPr>
+          <w:rFonts w:eastAsia="Calibri" w:cs="Calibri" w:ascii="Calibri" w:hAnsi="Calibri"/>
+          <w:i/>
+          <w:sz w:val="20"/>
+          <w:szCs w:val="20"/>
+        </w:rPr>
+        <w:t xml:space="preserve">(More points here available because I did not provide a code for this, </w:t>
+      </w:r>
+      <w:r>
+        <w:rPr>
+          <w:rFonts w:eastAsia="Calibri" w:cs="Calibri" w:ascii="Calibri" w:hAnsi="Calibri"/>
+          <w:i/>
+          <w:sz w:val="20"/>
+          <w:szCs w:val="20"/>
+        </w:rPr>
+        <w:t xml:space="preserve">this is a bit of self-learning task, I suggest to refer to </w:t>
+      </w:r>
+      <w:hyperlink r:id="rId4">
+        <w:r>
+          <w:rPr>
+            <w:rStyle w:val="Hyperlink"/>
+            <w:rFonts w:ascii="Aptos;Aptos EmbeddedFont;Aptos MSFontService;Calibri;Helvetica;sans-serif" w:hAnsi="Aptos;Aptos EmbeddedFont;Aptos MSFontService;Calibri;Helvetica;sans-serif"/>
+            <w:color w:val="000000"/>
+            <w:sz w:val="20"/>
+            <w:szCs w:val="20"/>
+          </w:rPr>
+          <w:t>https://machinelearningmastery.com/time-series-prediction-lstm-recurrent-neural-networks-python-keras/</w:t>
+        </w:r>
+      </w:hyperlink>
+      <w:r>
+        <w:rPr>
+          <w:rFonts w:eastAsia="Calibri" w:cs="Calibri" w:ascii="Calibri" w:hAnsi="Calibri"/>
+          <w:i/>
+          <w:sz w:val="20"/>
+          <w:szCs w:val="20"/>
+        </w:rPr>
+        <w:t xml:space="preserve">). </w:t>
+      </w:r>
+      <w:r>
+        <w:rPr>
+          <w:rFonts w:eastAsia="Calibri" w:cs="Calibri" w:ascii="Calibri" w:hAnsi="Calibri"/>
+          <w:b w:val="false"/>
+          <w:bCs w:val="false"/>
+          <w:i/>
+          <w:sz w:val="20"/>
+          <w:szCs w:val="20"/>
+        </w:rPr>
+        <w:t xml:space="preserve"> </w:t>
+      </w:r>
+    </w:p>
+    <w:p>
+      <w:pPr>
+        <w:pStyle w:val="normal1"/>
+        <w:spacing w:lineRule="auto" w:line="240" w:before="240" w:after="240"/>
+        <w:rPr>
+          <w:rFonts w:ascii="Calibri" w:hAnsi="Calibri" w:eastAsia="Calibri" w:cs="Calibri"/>
+          <w:i/>
+          <w:i/>
+          <w:sz w:val="20"/>
+          <w:szCs w:val="20"/>
+        </w:rPr>
+      </w:pPr>
+      <w:r>
+        <w:rPr>
+          <w:rFonts w:eastAsia="Calibri" w:cs="Calibri" w:ascii="Calibri" w:hAnsi="Calibri"/>
+          <w:i/>
+          <w:sz w:val="20"/>
+          <w:szCs w:val="20"/>
+        </w:rPr>
+        <w:t xml:space="preserve">Task </w:t>
+      </w:r>
+      <w:r>
+        <w:rPr>
+          <w:rFonts w:eastAsia="Calibri" w:cs="Calibri" w:ascii="Calibri" w:hAnsi="Calibri"/>
+          <w:i/>
+          <w:sz w:val="20"/>
+          <w:szCs w:val="20"/>
+        </w:rPr>
+        <w:t>5</w:t>
+      </w:r>
+      <w:r>
+        <w:rPr>
+          <w:rFonts w:eastAsia="Calibri" w:cs="Calibri" w:ascii="Calibri" w:hAnsi="Calibri"/>
+          <w:i/>
+          <w:sz w:val="20"/>
+          <w:szCs w:val="20"/>
+        </w:rPr>
+        <w:t xml:space="preserve">: Discuss the results. Can we ignore modeling and let Machine Leaning make prediction? </w:t>
+      </w:r>
+      <w:r>
+        <w:rPr>
+          <w:rFonts w:eastAsia="Calibri" w:cs="Calibri" w:ascii="Calibri" w:hAnsi="Calibri"/>
+          <w:i/>
+          <w:sz w:val="20"/>
+          <w:szCs w:val="20"/>
+        </w:rPr>
+        <w:t>What is a good prediction for these cases?</w:t>
+      </w:r>
+      <w:r>
+        <w:rPr>
+          <w:rFonts w:eastAsia="Calibri" w:cs="Calibri" w:ascii="Calibri" w:hAnsi="Calibri"/>
+          <w:i/>
+          <w:sz w:val="20"/>
+          <w:szCs w:val="20"/>
+        </w:rPr>
+        <w:t xml:space="preserve"> What are your conclusions? [</w:t>
+      </w:r>
+      <w:r>
+        <w:rPr>
+          <w:rFonts w:eastAsia="Calibri" w:cs="Calibri" w:ascii="Calibri" w:hAnsi="Calibri"/>
+          <w:i/>
+          <w:sz w:val="20"/>
+          <w:szCs w:val="20"/>
+        </w:rPr>
+        <w:t>15</w:t>
+      </w:r>
+      <w:r>
+        <w:rPr>
+          <w:rFonts w:eastAsia="Calibri" w:cs="Calibri" w:ascii="Calibri" w:hAnsi="Calibri"/>
+          <w:i/>
+          <w:sz w:val="20"/>
+          <w:szCs w:val="20"/>
+        </w:rPr>
         <w:t>]</w:t>
       </w:r>
     </w:p>
@@ -327,459 +2310,128 @@
         <w:spacing w:lineRule="auto" w:line="240" w:before="240" w:after="240"/>
         <w:rPr>
           <w:rFonts w:ascii="Calibri" w:hAnsi="Calibri" w:eastAsia="Calibri" w:cs="Calibri"/>
-          <w:i/>
-          <w:i/>
-          <w:sz w:val="20"/>
-          <w:szCs w:val="20"/>
-        </w:rPr>
-      </w:pPr>
-      <w:r>
-        <w:rPr>
-          <w:rFonts w:eastAsia="Calibri" w:cs="Calibri" w:ascii="Calibri" w:hAnsi="Calibri"/>
-          <w:i/>
-          <w:sz w:val="20"/>
-          <w:szCs w:val="20"/>
-        </w:rPr>
-        <w:t xml:space="preserve">Task 2: </w:t>
-      </w:r>
-      <w:r>
-        <w:rPr>
-          <w:rFonts w:eastAsia="Calibri" w:cs="Calibri" w:ascii="Calibri" w:hAnsi="Calibri"/>
-          <w:i/>
-          <w:sz w:val="20"/>
-          <w:szCs w:val="20"/>
-        </w:rPr>
-        <w:t xml:space="preserve">Generate a visualization of the milky way sector starting in center "M31" with radius=(8000, 8000) * lightyear </w:t>
-      </w:r>
-      <w:r>
-        <w:rPr>
-          <w:rFonts w:eastAsia="Calibri" w:cs="Calibri" w:ascii="Calibri" w:hAnsi="Calibri"/>
-          <w:i/>
-          <w:sz w:val="20"/>
-          <w:szCs w:val="20"/>
-        </w:rPr>
-        <w:t>. [5]</w:t>
-      </w:r>
-    </w:p>
-    <w:p>
-      <w:pPr>
-        <w:pStyle w:val="normal1"/>
-        <w:spacing w:lineRule="auto" w:line="240" w:before="240" w:after="240"/>
-        <w:rPr>
-          <w:rFonts w:ascii="Calibri" w:hAnsi="Calibri" w:eastAsia="Calibri" w:cs="Calibri"/>
-          <w:i/>
-          <w:i/>
-          <w:sz w:val="20"/>
-          <w:szCs w:val="20"/>
-        </w:rPr>
-      </w:pPr>
-      <w:r>
-        <w:rPr>
-          <w:rFonts w:eastAsia="Calibri" w:cs="Calibri" w:ascii="Calibri" w:hAnsi="Calibri"/>
-          <w:i/>
-          <w:sz w:val="20"/>
-          <w:szCs w:val="20"/>
-        </w:rPr>
-        <w:t xml:space="preserve">Task 3: </w:t>
-      </w:r>
-      <w:r>
-        <w:rPr>
-          <w:rFonts w:eastAsia="Calibri" w:cs="Calibri" w:ascii="Calibri" w:hAnsi="Calibri"/>
-          <w:i/>
-          <w:sz w:val="20"/>
-          <w:szCs w:val="20"/>
-        </w:rPr>
-        <w:t>Convert the image generated into a rgb np.array (each pixes will be a list of 3 number, Red, Green, Blue (rbg)</w:t>
-      </w:r>
-      <w:r>
-        <w:rPr>
-          <w:rFonts w:eastAsia="Calibri" w:cs="Calibri" w:ascii="Calibri" w:hAnsi="Calibri"/>
-          <w:i/>
-          <w:sz w:val="20"/>
-          <w:szCs w:val="20"/>
-        </w:rPr>
-        <w:t>. [5]</w:t>
-      </w:r>
-    </w:p>
-    <w:p>
-      <w:pPr>
-        <w:pStyle w:val="normal1"/>
-        <w:spacing w:lineRule="auto" w:line="240" w:before="240" w:after="240"/>
-        <w:rPr>
-          <w:rFonts w:ascii="Calibri" w:hAnsi="Calibri" w:eastAsia="Calibri" w:cs="Calibri"/>
-          <w:i/>
-          <w:i/>
-          <w:sz w:val="20"/>
-          <w:szCs w:val="20"/>
-        </w:rPr>
-      </w:pPr>
-      <w:r>
-        <w:rPr>
-          <w:rFonts w:eastAsia="Calibri" w:cs="Calibri" w:ascii="Calibri" w:hAnsi="Calibri"/>
-          <w:i/>
-          <w:sz w:val="20"/>
-          <w:szCs w:val="20"/>
-        </w:rPr>
-        <w:t>Task 4: Generate some category from the task 3 data [5]</w:t>
-      </w:r>
-    </w:p>
-    <w:p>
-      <w:pPr>
-        <w:pStyle w:val="normal1"/>
-        <w:spacing w:lineRule="auto" w:line="240" w:before="240" w:after="240"/>
-        <w:rPr>
-          <w:rFonts w:ascii="Calibri" w:hAnsi="Calibri" w:eastAsia="Calibri" w:cs="Calibri"/>
-          <w:i/>
-          <w:i/>
-          <w:sz w:val="20"/>
-          <w:szCs w:val="20"/>
-        </w:rPr>
-      </w:pPr>
-      <w:r>
-        <w:rPr>
-          <w:rFonts w:eastAsia="Calibri" w:cs="Calibri" w:ascii="Calibri" w:hAnsi="Calibri"/>
-          <w:i/>
-          <w:sz w:val="20"/>
-          <w:szCs w:val="20"/>
-        </w:rPr>
-        <w:t>Task 5: Use K-NN (Nearest neighbor, not discussed in class but extremely simple) or K-means to cluster the data [5]</w:t>
-      </w:r>
-    </w:p>
-    <w:p>
-      <w:pPr>
-        <w:pStyle w:val="normal1"/>
-        <w:spacing w:lineRule="auto" w:line="240" w:before="240" w:after="240"/>
-        <w:rPr>
-          <w:rFonts w:ascii="Calibri" w:hAnsi="Calibri" w:eastAsia="Calibri" w:cs="Calibri"/>
-          <w:i/>
-          <w:i/>
-          <w:sz w:val="20"/>
-          <w:szCs w:val="20"/>
-        </w:rPr>
-      </w:pPr>
-      <w:r>
-        <w:rPr>
-          <w:rFonts w:eastAsia="Calibri" w:cs="Calibri" w:ascii="Calibri" w:hAnsi="Calibri"/>
-          <w:i/>
-          <w:sz w:val="20"/>
-          <w:szCs w:val="20"/>
-        </w:rPr>
-        <w:t>Task 6: over-impose your cluster to the image generate in task 2</w:t>
-      </w:r>
-    </w:p>
-    <w:p>
-      <w:pPr>
-        <w:pStyle w:val="normal1"/>
-        <w:spacing w:lineRule="auto" w:line="240" w:before="240" w:after="240"/>
-        <w:rPr>
-          <w:rFonts w:ascii="Calibri" w:hAnsi="Calibri" w:eastAsia="Calibri" w:cs="Calibri"/>
-          <w:i/>
-          <w:i/>
-          <w:sz w:val="20"/>
-          <w:szCs w:val="20"/>
-        </w:rPr>
-      </w:pPr>
-      <w:r>
-        <w:rPr>
-          <w:rFonts w:eastAsia="Calibri" w:cs="Calibri" w:ascii="Calibri" w:hAnsi="Calibri"/>
-          <w:i/>
-          <w:sz w:val="20"/>
-          <w:szCs w:val="20"/>
-        </w:rPr>
-        <w:t xml:space="preserve">Task 7: try different category (task 4), repeating tasks 5 and 6, and provide an explanation of your results. What can we learn from a unsupervised model of our galaxy? </w:t>
-      </w:r>
-    </w:p>
-    <w:p>
-      <w:pPr>
-        <w:pStyle w:val="normal1"/>
-        <w:spacing w:lineRule="auto" w:line="240" w:before="240" w:after="240"/>
-        <w:rPr>
-          <w:rFonts w:ascii="Calibri" w:hAnsi="Calibri" w:eastAsia="Calibri" w:cs="Calibri"/>
-          <w:b/>
-          <w:i/>
-          <w:i/>
-          <w:sz w:val="20"/>
-          <w:szCs w:val="20"/>
-        </w:rPr>
-      </w:pPr>
-      <w:r>
-        <w:rPr>
-          <w:rFonts w:eastAsia="Calibri" w:cs="Calibri" w:ascii="Calibri" w:hAnsi="Calibri"/>
-          <w:b/>
-          <w:i/>
-          <w:sz w:val="20"/>
-          <w:szCs w:val="20"/>
-        </w:rPr>
-      </w:r>
-    </w:p>
-    <w:p>
-      <w:pPr>
-        <w:pStyle w:val="normal1"/>
-        <w:spacing w:lineRule="auto" w:line="240" w:before="240" w:after="240"/>
-        <w:rPr>
-          <w:rFonts w:ascii="Calibri" w:hAnsi="Calibri" w:eastAsia="Calibri" w:cs="Calibri"/>
-          <w:b/>
-          <w:i/>
-          <w:i/>
-          <w:sz w:val="20"/>
-          <w:szCs w:val="20"/>
-        </w:rPr>
-      </w:pPr>
-      <w:r>
-        <w:rPr>
-          <w:rFonts w:eastAsia="Calibri" w:cs="Calibri" w:ascii="Calibri" w:hAnsi="Calibri"/>
-          <w:b/>
-          <w:i/>
-          <w:sz w:val="20"/>
-          <w:szCs w:val="20"/>
-        </w:rPr>
-        <w:t xml:space="preserve">TOPIC 2: </w:t>
-      </w:r>
-      <w:r>
-        <w:rPr>
-          <w:rFonts w:eastAsia="Calibri" w:cs="Calibri" w:ascii="Calibri" w:hAnsi="Calibri"/>
-          <w:b/>
-          <w:i/>
-          <w:sz w:val="20"/>
-          <w:szCs w:val="20"/>
-        </w:rPr>
-        <w:t xml:space="preserve">Supervised learning: </w:t>
-      </w:r>
-      <w:r>
-        <w:rPr>
-          <w:rFonts w:eastAsia="Calibri" w:cs="Calibri" w:ascii="Calibri" w:hAnsi="Calibri"/>
-          <w:b/>
-          <w:i/>
-          <w:sz w:val="20"/>
-          <w:szCs w:val="20"/>
-        </w:rPr>
-        <w:t>Machines versus human models to predict  epidemics?!?</w:t>
-      </w:r>
-    </w:p>
-    <w:p>
-      <w:pPr>
-        <w:pStyle w:val="normal1"/>
-        <w:spacing w:lineRule="auto" w:line="240" w:before="240" w:after="240"/>
-        <w:rPr>
-          <w:rFonts w:ascii="Calibri" w:hAnsi="Calibri" w:eastAsia="Calibri" w:cs="Calibri"/>
-          <w:i/>
-          <w:i/>
-          <w:sz w:val="20"/>
-          <w:szCs w:val="20"/>
-        </w:rPr>
-      </w:pPr>
-      <w:r>
-        <w:rPr>
-          <w:rFonts w:eastAsia="Calibri" w:cs="Calibri" w:ascii="Calibri" w:hAnsi="Calibri"/>
-          <w:i/>
-          <w:sz w:val="20"/>
-          <w:szCs w:val="20"/>
-        </w:rPr>
-        <w:t xml:space="preserve">Task 1: </w:t>
-      </w:r>
-      <w:r>
-        <w:rPr>
-          <w:rFonts w:eastAsia="Calibri" w:cs="Calibri" w:ascii="Calibri" w:hAnsi="Calibri"/>
-          <w:i/>
-          <w:sz w:val="20"/>
-          <w:szCs w:val="20"/>
-        </w:rPr>
-        <w:t xml:space="preserve">Reproduce the project 2 </w:t>
-      </w:r>
-      <w:r>
-        <w:rPr>
-          <w:rFonts w:eastAsia="Calibri" w:cs="Calibri" w:ascii="Calibri" w:hAnsi="Calibri"/>
-          <w:i/>
-          <w:sz w:val="20"/>
-          <w:szCs w:val="20"/>
-        </w:rPr>
-        <w:t xml:space="preserve">exercise 5 </w:t>
-      </w:r>
-      <w:r>
-        <w:rPr>
-          <w:rFonts w:eastAsia="Calibri" w:cs="Calibri" w:ascii="Calibri" w:hAnsi="Calibri"/>
-          <w:i/>
-          <w:sz w:val="20"/>
-          <w:szCs w:val="20"/>
-        </w:rPr>
-        <w:t xml:space="preserve">plots for </w:t>
-      </w:r>
-      <w:r>
-        <w:rPr>
-          <w:rFonts w:eastAsia="Calibri" w:cs="Calibri" w:ascii="Calibri" w:hAnsi="Calibri"/>
-          <w:i/>
-          <w:sz w:val="20"/>
-          <w:szCs w:val="20"/>
-        </w:rPr>
-        <w:t>Ebola epidemic</w:t>
-      </w:r>
-      <w:r>
-        <w:rPr>
-          <w:rFonts w:eastAsia="Calibri" w:cs="Calibri" w:ascii="Calibri" w:hAnsi="Calibri"/>
-          <w:i/>
-          <w:sz w:val="20"/>
-          <w:szCs w:val="20"/>
-        </w:rPr>
-        <w:t xml:space="preserve"> </w:t>
-      </w:r>
-      <w:r>
-        <w:rPr>
-          <w:rFonts w:eastAsia="Calibri" w:cs="Calibri" w:ascii="Calibri" w:hAnsi="Calibri"/>
-          <w:i/>
-          <w:sz w:val="20"/>
-          <w:szCs w:val="20"/>
-        </w:rPr>
-        <w:t>in West Africa</w:t>
-      </w:r>
-      <w:r>
-        <w:rPr>
-          <w:rFonts w:eastAsia="Calibri" w:cs="Calibri" w:ascii="Calibri" w:hAnsi="Calibri"/>
-          <w:i/>
-          <w:sz w:val="20"/>
-          <w:szCs w:val="20"/>
-        </w:rPr>
-        <w:t xml:space="preserve"> </w:t>
-      </w:r>
-      <w:r>
-        <w:rPr>
-          <w:rFonts w:eastAsia="Calibri" w:cs="Calibri" w:ascii="Calibri" w:hAnsi="Calibri"/>
-          <w:i/>
-          <w:sz w:val="20"/>
-          <w:szCs w:val="20"/>
-        </w:rPr>
-        <w:t xml:space="preserve">(data points and model). If you are not confident from previous results, ask the TAs for the correct solution </w:t>
-      </w:r>
-      <w:r>
-        <w:rPr>
-          <w:rFonts w:eastAsia="Calibri" w:cs="Calibri" w:ascii="Calibri" w:hAnsi="Calibri"/>
-          <w:i/>
-          <w:sz w:val="20"/>
-          <w:szCs w:val="20"/>
-        </w:rPr>
-        <w:t xml:space="preserve">[5] </w:t>
-      </w:r>
-    </w:p>
-    <w:p>
-      <w:pPr>
-        <w:pStyle w:val="normal1"/>
-        <w:spacing w:lineRule="auto" w:line="240" w:before="240" w:after="240"/>
-        <w:rPr>
-          <w:rFonts w:ascii="Calibri" w:hAnsi="Calibri" w:eastAsia="Calibri" w:cs="Calibri"/>
-          <w:i/>
-          <w:i/>
-          <w:sz w:val="20"/>
-          <w:szCs w:val="20"/>
-        </w:rPr>
-      </w:pPr>
-      <w:r>
-        <w:rPr>
-          <w:rFonts w:eastAsia="Calibri" w:cs="Calibri" w:ascii="Calibri" w:hAnsi="Calibri"/>
-          <w:i/>
-          <w:sz w:val="20"/>
-          <w:szCs w:val="20"/>
-        </w:rPr>
-        <w:t>Task 2: Train a line with linear regression on the data for the three countries. [5]</w:t>
-      </w:r>
-    </w:p>
-    <w:p>
-      <w:pPr>
-        <w:pStyle w:val="normal1"/>
-        <w:spacing w:lineRule="auto" w:line="240" w:before="240" w:after="240"/>
-        <w:rPr>
-          <w:rFonts w:ascii="Calibri" w:hAnsi="Calibri" w:eastAsia="Calibri" w:cs="Calibri"/>
-          <w:i/>
-          <w:i/>
-          <w:sz w:val="20"/>
-          <w:szCs w:val="20"/>
-        </w:rPr>
-      </w:pPr>
-      <w:r>
-        <w:rPr>
-          <w:rFonts w:eastAsia="Calibri" w:cs="Calibri" w:ascii="Calibri" w:hAnsi="Calibri"/>
-          <w:i/>
-          <w:sz w:val="20"/>
-          <w:szCs w:val="20"/>
-        </w:rPr>
-        <w:t>Task 3: Train a better fitting function than a single line with linear regression on the data for the three countries. [5]</w:t>
-      </w:r>
-    </w:p>
-    <w:p>
-      <w:pPr>
-        <w:pStyle w:val="normal1"/>
-        <w:spacing w:lineRule="auto" w:line="240" w:before="240" w:after="240"/>
-        <w:rPr>
-          <w:rFonts w:ascii="Calibri" w:hAnsi="Calibri" w:eastAsia="Calibri" w:cs="Calibri"/>
-          <w:i/>
-          <w:i/>
-          <w:sz w:val="20"/>
-          <w:szCs w:val="20"/>
-        </w:rPr>
-      </w:pPr>
-      <w:r>
-        <w:rPr>
-          <w:rFonts w:eastAsia="Calibri" w:cs="Calibri" w:ascii="Calibri" w:hAnsi="Calibri"/>
-          <w:i/>
-          <w:sz w:val="20"/>
-          <w:szCs w:val="20"/>
-        </w:rPr>
-        <w:t>Task 4: Train a NN (LSTM) network and predict the epidemic evolution. [10]</w:t>
-      </w:r>
-    </w:p>
-    <w:p>
-      <w:pPr>
-        <w:pStyle w:val="normal1"/>
-        <w:spacing w:lineRule="auto" w:line="240" w:before="240" w:after="240"/>
-        <w:rPr>
-          <w:rFonts w:ascii="Calibri" w:hAnsi="Calibri" w:eastAsia="Calibri" w:cs="Calibri"/>
-          <w:i/>
-          <w:i/>
-          <w:sz w:val="20"/>
-          <w:szCs w:val="20"/>
-        </w:rPr>
-      </w:pPr>
-      <w:r>
-        <w:rPr>
-          <w:rFonts w:eastAsia="Calibri" w:cs="Calibri" w:ascii="Calibri" w:hAnsi="Calibri"/>
-          <w:i/>
-          <w:sz w:val="20"/>
-          <w:szCs w:val="20"/>
-        </w:rPr>
-        <w:t xml:space="preserve"> </w:t>
-      </w:r>
-      <w:r>
-        <w:rPr>
-          <w:rFonts w:eastAsia="Calibri" w:cs="Calibri" w:ascii="Calibri" w:hAnsi="Calibri"/>
-          <w:i/>
-          <w:sz w:val="20"/>
-          <w:szCs w:val="20"/>
-        </w:rPr>
-        <w:t>Task 5: Discuss the results. Can we ignore modeling and let Machine Leaning make prediction? What are your conclusions?</w:t>
-      </w:r>
-      <w:r>
-        <w:rPr>
-          <w:rFonts w:eastAsia="Calibri" w:cs="Calibri" w:ascii="Calibri" w:hAnsi="Calibri"/>
-          <w:i/>
-          <w:sz w:val="20"/>
-          <w:szCs w:val="20"/>
-        </w:rPr>
-        <w:t xml:space="preserve"> [20]</w:t>
-      </w:r>
-    </w:p>
-    <w:p>
-      <w:pPr>
-        <w:pStyle w:val="normal1"/>
-        <w:spacing w:lineRule="auto" w:line="240" w:before="240" w:after="240"/>
-        <w:rPr>
-          <w:rFonts w:ascii="Calibri" w:hAnsi="Calibri" w:eastAsia="Calibri" w:cs="Calibri"/>
-          <w:i/>
-          <w:i/>
-          <w:sz w:val="20"/>
-          <w:szCs w:val="20"/>
-        </w:rPr>
-      </w:pPr>
-      <w:r>
-        <w:rPr>
-          <w:rFonts w:eastAsia="Calibri" w:cs="Calibri" w:ascii="Calibri" w:hAnsi="Calibri"/>
+          <w:b/>
+          <w:i/>
+          <w:i/>
+          <w:sz w:val="20"/>
+          <w:szCs w:val="20"/>
+        </w:rPr>
+      </w:pPr>
+      <w:r>
+        <w:rPr>
+          <w:rFonts w:eastAsia="Calibri" w:cs="Calibri" w:ascii="Calibri" w:hAnsi="Calibri"/>
+          <w:b/>
+          <w:i/>
+          <w:sz w:val="20"/>
+          <w:szCs w:val="20"/>
+        </w:rPr>
+      </w:r>
+    </w:p>
+    <w:p>
+      <w:pPr>
+        <w:pStyle w:val="normal1"/>
+        <w:spacing w:lineRule="auto" w:line="240" w:before="240" w:after="240"/>
+        <w:rPr>
+          <w:rFonts w:ascii="Calibri" w:hAnsi="Calibri" w:eastAsia="Calibri" w:cs="Calibri"/>
+          <w:b/>
+          <w:i/>
+          <w:i/>
+          <w:sz w:val="20"/>
+          <w:szCs w:val="20"/>
+        </w:rPr>
+      </w:pPr>
+      <w:r>
+        <w:rPr>
+          <w:rFonts w:eastAsia="Calibri" w:cs="Calibri" w:ascii="Calibri" w:hAnsi="Calibri"/>
+          <w:b/>
+          <w:i/>
+          <w:sz w:val="20"/>
+          <w:szCs w:val="20"/>
+        </w:rPr>
+        <w:t>TIPS:</w:t>
+      </w:r>
+    </w:p>
+    <w:p>
+      <w:pPr>
+        <w:pStyle w:val="normal1"/>
+        <w:spacing w:lineRule="auto" w:line="240" w:before="240" w:after="240"/>
+        <w:rPr>
+          <w:rFonts w:ascii="Calibri" w:hAnsi="Calibri" w:eastAsia="Calibri" w:cs="Calibri"/>
+          <w:b w:val="false"/>
+          <w:bCs w:val="false"/>
+          <w:i/>
+          <w:i/>
+          <w:sz w:val="20"/>
+          <w:szCs w:val="20"/>
+        </w:rPr>
+      </w:pPr>
+      <w:r>
+        <w:rPr>
+          <w:rFonts w:eastAsia="Calibri" w:cs="Calibri" w:ascii="Calibri" w:hAnsi="Calibri"/>
+          <w:b w:val="false"/>
+          <w:bCs w:val="false"/>
+          <w:i/>
+          <w:sz w:val="20"/>
+          <w:szCs w:val="20"/>
+        </w:rPr>
+        <w:t xml:space="preserve">Here the work is to adopt a set of ML tools. Make sure that sklearn and tensorflow are properly installed.  Using an environment with python 3.13 will make this easier. </w:t>
+      </w:r>
+      <w:r>
+        <w:rPr>
+          <w:rFonts w:eastAsia="Calibri" w:cs="Calibri" w:ascii="Calibri" w:hAnsi="Calibri"/>
+          <w:b w:val="false"/>
+          <w:bCs w:val="false"/>
+          <w:i/>
+          <w:sz w:val="20"/>
+          <w:szCs w:val="20"/>
+        </w:rPr>
+        <w:t>If you are having problem in the installation of these library, make a new environment and re-install them.</w:t>
+      </w:r>
+    </w:p>
+    <w:p>
+      <w:pPr>
+        <w:pStyle w:val="normal1"/>
+        <w:spacing w:lineRule="auto" w:line="240" w:before="240" w:after="240"/>
+        <w:rPr>
+          <w:rFonts w:ascii="Calibri" w:hAnsi="Calibri" w:eastAsia="Calibri" w:cs="Calibri"/>
+          <w:b w:val="false"/>
+          <w:bCs w:val="false"/>
+          <w:i/>
+          <w:i/>
+          <w:sz w:val="20"/>
+          <w:szCs w:val="20"/>
+        </w:rPr>
+      </w:pPr>
+      <w:r>
+        <w:rPr>
+          <w:rFonts w:eastAsia="Calibri" w:cs="Calibri" w:ascii="Calibri" w:hAnsi="Calibri"/>
+          <w:b w:val="false"/>
+          <w:bCs w:val="false"/>
+          <w:i/>
+          <w:sz w:val="20"/>
+          <w:szCs w:val="20"/>
+        </w:rPr>
+      </w:r>
+    </w:p>
+    <w:p>
+      <w:pPr>
+        <w:pStyle w:val="normal1"/>
+        <w:spacing w:lineRule="auto" w:line="240" w:before="240" w:after="240"/>
+        <w:rPr>
+          <w:rFonts w:ascii="Calibri" w:hAnsi="Calibri" w:eastAsia="Calibri" w:cs="Calibri"/>
+          <w:b w:val="false"/>
+          <w:bCs w:val="false"/>
+          <w:i/>
+          <w:i/>
+          <w:sz w:val="20"/>
+          <w:szCs w:val="20"/>
+        </w:rPr>
+      </w:pPr>
+      <w:r>
+        <w:rPr>
+          <w:rFonts w:eastAsia="Calibri" w:cs="Calibri" w:ascii="Calibri" w:hAnsi="Calibri"/>
+          <w:b w:val="false"/>
+          <w:bCs w:val="false"/>
           <w:i/>
           <w:sz w:val="20"/>
           <w:szCs w:val="20"/>
@@ -916,7 +2568,7 @@
           <w:sz w:val="20"/>
           <w:szCs w:val="20"/>
         </w:rPr>
-        <w:t>Your notebook has to be working.</w:t>
+        <w:t xml:space="preserve">Your notebook has to be working. </w:t>
       </w:r>
     </w:p>
     <w:p>
@@ -998,30 +2650,8 @@
       <w:r>
         <w:rPr>
           <w:rFonts w:eastAsia="Calibri" w:cs="Calibri" w:ascii="Calibri" w:hAnsi="Calibri"/>
-          <w:b/>
-          <w:i/>
-          <w:sz w:val="20"/>
-          <w:szCs w:val="20"/>
-        </w:rPr>
-      </w:r>
-    </w:p>
-    <w:p>
-      <w:pPr>
-        <w:pStyle w:val="normal1"/>
-        <w:spacing w:lineRule="auto" w:line="240" w:before="240" w:after="240"/>
-        <w:rPr>
-          <w:rFonts w:ascii="Calibri" w:hAnsi="Calibri" w:eastAsia="Calibri" w:cs="Calibri"/>
-          <w:b/>
-          <w:i/>
-          <w:i/>
-          <w:sz w:val="20"/>
-          <w:szCs w:val="20"/>
-        </w:rPr>
-      </w:pPr>
-      <w:r>
-        <w:rPr>
-          <w:rFonts w:eastAsia="Calibri" w:cs="Calibri" w:ascii="Calibri" w:hAnsi="Calibri"/>
-          <w:b/>
+          <w:b w:val="false"/>
+          <w:bCs w:val="false"/>
           <w:i/>
           <w:sz w:val="20"/>
           <w:szCs w:val="20"/>
@@ -1094,38 +2724,56 @@
           <w:sz w:val="20"/>
           <w:szCs w:val="20"/>
         </w:rPr>
-        <w:t xml:space="preserve">Git: </w:t>
-      </w:r>
-      <w:r>
-        <w:rPr>
-          <w:rFonts w:eastAsia="Calibri" w:cs="Calibri" w:ascii="Calibri" w:hAnsi="Calibri"/>
-          <w:i/>
-          <w:sz w:val="20"/>
-          <w:szCs w:val="20"/>
-        </w:rPr>
-        <w:t>you should already have your repo. Make a new folder for project 4 and push it.</w:t>
-      </w:r>
-    </w:p>
-    <w:p>
-      <w:pPr>
-        <w:pStyle w:val="normal1"/>
-        <w:spacing w:lineRule="auto" w:line="240" w:before="240" w:after="240"/>
-        <w:rPr>
-          <w:rFonts w:ascii="Calibri" w:hAnsi="Calibri" w:eastAsia="Calibri" w:cs="Calibri"/>
-          <w:i/>
-          <w:i/>
-          <w:sz w:val="20"/>
-          <w:szCs w:val="20"/>
-        </w:rPr>
-      </w:pPr>
-      <w:r>
-        <w:rPr>
-          <w:rFonts w:eastAsia="Calibri" w:cs="Calibri" w:ascii="Calibri" w:hAnsi="Calibri"/>
-          <w:i/>
-          <w:sz w:val="20"/>
-          <w:szCs w:val="20"/>
-        </w:rPr>
-        <w:t xml:space="preserve">In the jupyter notebook, use </w:t>
+        <w:t xml:space="preserve">Git: you should already have your repo. Make a new folder for project 4 and push I </w:t>
+      </w:r>
+      <w:r>
+        <w:rPr>
+          <w:rFonts w:eastAsia="Calibri" w:cs="Calibri" w:ascii="Calibri" w:hAnsi="Calibri"/>
+          <w:i/>
+          <w:sz w:val="20"/>
+          <w:szCs w:val="20"/>
+        </w:rPr>
+        <w:t>(move your previous assignments in dedicated folders).</w:t>
+      </w:r>
+    </w:p>
+    <w:p>
+      <w:pPr>
+        <w:pStyle w:val="normal1"/>
+        <w:spacing w:lineRule="auto" w:line="240" w:before="240" w:after="240"/>
+        <w:rPr>
+          <w:rFonts w:ascii="Calibri" w:hAnsi="Calibri" w:eastAsia="Calibri" w:cs="Calibri"/>
+          <w:i/>
+          <w:i/>
+          <w:sz w:val="20"/>
+          <w:szCs w:val="20"/>
+        </w:rPr>
+      </w:pPr>
+      <w:r>
+        <w:rPr>
+          <w:rFonts w:eastAsia="Calibri" w:cs="Calibri" w:ascii="Calibri" w:hAnsi="Calibri"/>
+          <w:i/>
+          <w:sz w:val="20"/>
+          <w:szCs w:val="20"/>
+        </w:rPr>
+        <w:t xml:space="preserve">In </w:t>
+      </w:r>
+      <w:r>
+        <w:rPr>
+          <w:rFonts w:eastAsia="Calibri" w:cs="Calibri" w:ascii="Calibri" w:hAnsi="Calibri"/>
+          <w:i/>
+          <w:sz w:val="20"/>
+          <w:szCs w:val="20"/>
+        </w:rPr>
+        <w:t>a new</w:t>
+      </w:r>
+      <w:r>
+        <w:rPr>
+          <w:rFonts w:eastAsia="Calibri" w:cs="Calibri" w:ascii="Calibri" w:hAnsi="Calibri"/>
+          <w:i/>
+          <w:sz w:val="20"/>
+          <w:szCs w:val="20"/>
+        </w:rPr>
+        <w:t xml:space="preserve"> jupyter notebook, use </w:t>
       </w:r>
       <w:r>
         <w:rPr>
@@ -1144,7 +2792,43 @@
           <w:sz w:val="20"/>
           <w:szCs w:val="20"/>
         </w:rPr>
-        <w:t>task 1, task 2, etc to give the answer to each point using Markdown syntax. Please use, for each task, one cell to help us going over your work.</w:t>
+        <w:t>task 1, task 2, etc to give the answer to each point using Markdown syntax. Please use, for each task, one cell to help us going over your wor</w:t>
+      </w:r>
+      <w:r>
+        <w:rPr>
+          <w:rFonts w:eastAsia="Calibri" w:cs="Calibri" w:ascii="Calibri" w:hAnsi="Calibri"/>
+          <w:i/>
+          <w:sz w:val="20"/>
+          <w:szCs w:val="20"/>
+        </w:rPr>
+        <w:t>k</w:t>
+      </w:r>
+      <w:r>
+        <w:rPr>
+          <w:rFonts w:eastAsia="Calibri" w:cs="Calibri" w:ascii="Calibri" w:hAnsi="Calibri"/>
+          <w:i/>
+          <w:sz w:val="20"/>
+          <w:szCs w:val="20"/>
+        </w:rPr>
+        <w:t xml:space="preserve"> </w:t>
+      </w:r>
+      <w:r>
+        <w:rPr>
+          <w:rFonts w:eastAsia="Calibri" w:cs="Calibri" w:ascii="Calibri" w:hAnsi="Calibri"/>
+          <w:i/>
+          <w:sz w:val="20"/>
+          <w:szCs w:val="20"/>
+        </w:rPr>
+        <w:t>effectively</w:t>
+      </w:r>
+      <w:r>
+        <w:rPr>
+          <w:rFonts w:eastAsia="Calibri" w:cs="Calibri" w:ascii="Calibri" w:hAnsi="Calibri"/>
+          <w:i/>
+          <w:sz w:val="20"/>
+          <w:szCs w:val="20"/>
+        </w:rPr>
+        <w:t>.</w:t>
       </w:r>
     </w:p>
     <w:p>
@@ -1213,7 +2897,34 @@
           <w:sz w:val="20"/>
           <w:szCs w:val="20"/>
         </w:rPr>
-        <w:t>x</w:t>
+        <w:t>4</w:t>
+      </w:r>
+      <w:r>
+        <w:rPr>
+          <w:rFonts w:eastAsia="Calibri" w:cs="Calibri" w:ascii="Calibri" w:hAnsi="Calibri"/>
+          <w:i/>
+          <w:sz w:val="20"/>
+          <w:szCs w:val="20"/>
+        </w:rPr>
+        <w:t>5</w:t>
+      </w:r>
+      <w:r>
+        <w:rPr>
+          <w:rFonts w:eastAsia="Calibri" w:cs="Calibri" w:ascii="Calibri" w:hAnsi="Calibri"/>
+          <w:i/>
+          <w:sz w:val="20"/>
+          <w:szCs w:val="20"/>
+        </w:rPr>
+        <w:t xml:space="preserve"> + </w:t>
+      </w:r>
+      <w:r>
+        <w:rPr>
+          <w:rFonts w:eastAsia="Calibri" w:cs="Calibri" w:ascii="Calibri" w:hAnsi="Calibri"/>
+          <w:i/>
+          <w:sz w:val="20"/>
+          <w:szCs w:val="20"/>
+        </w:rPr>
+        <w:t>60</w:t>
       </w:r>
       <w:r>
         <w:rPr>
@@ -1306,7 +3017,55 @@
           <w:szCs w:val="20"/>
           <w:u w:val="none"/>
         </w:rPr>
-        <w:t>If AI is used  the quality factor will be equal to zero. If AI is used and not stated, it is considered cheating and the project will be given 0 points.</w:t>
+        <w:t xml:space="preserve">If AI is used  the quality factor will be equal to zero. If AI is used and not stated, it is considered cheating and the </w:t>
+      </w:r>
+      <w:r>
+        <w:rPr>
+          <w:rFonts w:eastAsia="Calibri" w:cs="Calibri" w:ascii="Calibri" w:hAnsi="Calibri"/>
+          <w:b w:val="false"/>
+          <w:bCs w:val="false"/>
+          <w:i/>
+          <w:sz w:val="20"/>
+          <w:szCs w:val="20"/>
+          <w:u w:val="none"/>
+        </w:rPr>
+        <w:t>whole</w:t>
+      </w:r>
+      <w:r>
+        <w:rPr>
+          <w:rFonts w:eastAsia="Calibri" w:cs="Calibri" w:ascii="Calibri" w:hAnsi="Calibri"/>
+          <w:b w:val="false"/>
+          <w:bCs w:val="false"/>
+          <w:i/>
+          <w:sz w:val="20"/>
+          <w:szCs w:val="20"/>
+          <w:u w:val="none"/>
+        </w:rPr>
+        <w:t xml:space="preserve"> project will </w:t>
+      </w:r>
+      <w:r>
+        <w:rPr>
+          <w:rFonts w:eastAsia="Calibri" w:cs="Calibri" w:ascii="Calibri" w:hAnsi="Calibri"/>
+          <w:b w:val="false"/>
+          <w:bCs w:val="false"/>
+          <w:i/>
+          <w:sz w:val="20"/>
+          <w:szCs w:val="20"/>
+          <w:u w:val="none"/>
+        </w:rPr>
+        <w:t>receive</w:t>
+      </w:r>
+      <w:r>
+        <w:rPr>
+          <w:rFonts w:eastAsia="Calibri" w:cs="Calibri" w:ascii="Calibri" w:hAnsi="Calibri"/>
+          <w:b w:val="false"/>
+          <w:bCs w:val="false"/>
+          <w:i/>
+          <w:sz w:val="20"/>
+          <w:szCs w:val="20"/>
+          <w:u w:val="none"/>
+        </w:rPr>
+        <w:t xml:space="preserve"> 0 points.</w:t>
       </w:r>
     </w:p>
     <w:p>
@@ -1353,6 +3112,90 @@
         <w:spacing w:lineRule="auto" w:line="240" w:before="240" w:after="240"/>
         <w:rPr>
           <w:rFonts w:ascii="Calibri" w:hAnsi="Calibri" w:eastAsia="Calibri" w:cs="Calibri"/>
+          <w:i/>
+          <w:i/>
+          <w:sz w:val="20"/>
+          <w:szCs w:val="20"/>
+        </w:rPr>
+      </w:pPr>
+      <w:r>
+        <w:rPr>
+          <w:rFonts w:eastAsia="Calibri" w:cs="Calibri" w:ascii="Calibri" w:hAnsi="Calibri"/>
+          <w:i/>
+          <w:sz w:val="20"/>
+          <w:szCs w:val="20"/>
+        </w:rPr>
+      </w:r>
+    </w:p>
+    <w:p>
+      <w:pPr>
+        <w:pStyle w:val="normal1"/>
+        <w:spacing w:lineRule="auto" w:line="240" w:before="240" w:after="240"/>
+        <w:rPr>
+          <w:rFonts w:ascii="Calibri" w:hAnsi="Calibri" w:eastAsia="Calibri" w:cs="Calibri"/>
+          <w:i/>
+          <w:i/>
+          <w:sz w:val="20"/>
+          <w:szCs w:val="20"/>
+        </w:rPr>
+      </w:pPr>
+      <w:r>
+        <w:rPr>
+          <w:rFonts w:eastAsia="Calibri" w:cs="Calibri" w:ascii="Calibri" w:hAnsi="Calibri"/>
+          <w:i/>
+          <w:sz w:val="20"/>
+          <w:szCs w:val="20"/>
+        </w:rPr>
+      </w:r>
+    </w:p>
+    <w:p>
+      <w:pPr>
+        <w:pStyle w:val="normal1"/>
+        <w:spacing w:lineRule="auto" w:line="240" w:before="240" w:after="240"/>
+        <w:rPr>
+          <w:rFonts w:ascii="Calibri" w:hAnsi="Calibri" w:eastAsia="Calibri" w:cs="Calibri"/>
+          <w:i/>
+          <w:i/>
+          <w:sz w:val="20"/>
+          <w:szCs w:val="20"/>
+        </w:rPr>
+      </w:pPr>
+      <w:r>
+        <w:rPr>
+          <w:rFonts w:eastAsia="Calibri" w:cs="Calibri" w:ascii="Calibri" w:hAnsi="Calibri"/>
+          <w:i/>
+          <w:sz w:val="20"/>
+          <w:szCs w:val="20"/>
+        </w:rPr>
+      </w:r>
+    </w:p>
+    <w:p>
+      <w:pPr>
+        <w:pStyle w:val="normal1"/>
+        <w:spacing w:lineRule="auto" w:line="240" w:before="240" w:after="240"/>
+        <w:rPr>
+          <w:rFonts w:ascii="Calibri" w:hAnsi="Calibri" w:eastAsia="Calibri" w:cs="Calibri"/>
+          <w:i/>
+          <w:i/>
+          <w:sz w:val="20"/>
+          <w:szCs w:val="20"/>
+        </w:rPr>
+      </w:pPr>
+      <w:r>
+        <w:rPr>
+          <w:rFonts w:eastAsia="Calibri" w:cs="Calibri" w:ascii="Calibri" w:hAnsi="Calibri"/>
+          <w:i/>
+          <w:sz w:val="20"/>
+          <w:szCs w:val="20"/>
+        </w:rPr>
+      </w:r>
+    </w:p>
+    <w:p>
+      <w:pPr>
+        <w:pStyle w:val="normal1"/>
+        <w:spacing w:lineRule="auto" w:line="240" w:before="240" w:after="240"/>
+        <w:rPr>
+          <w:rFonts w:ascii="Calibri" w:hAnsi="Calibri" w:eastAsia="Calibri" w:cs="Calibri"/>
           <w:b/>
           <w:i/>
           <w:i/>
@@ -1431,7 +3274,26 @@
           <w:sz w:val="20"/>
           <w:szCs w:val="20"/>
         </w:rPr>
-        <w:t xml:space="preserve">Up to 5 extra points for proper use of </w:t>
+        <w:t xml:space="preserve">Up to 5 extra points for </w:t>
+      </w:r>
+      <w:r>
+        <w:rPr>
+          <w:rFonts w:eastAsia="Calibri" w:cs="Calibri" w:ascii="Calibri" w:hAnsi="Calibri"/>
+          <w:i/>
+          <w:sz w:val="20"/>
+          <w:szCs w:val="20"/>
+          <w:u w:val="single"/>
+        </w:rPr>
+        <w:t>proper use</w:t>
+      </w:r>
+      <w:r>
+        <w:rPr>
+          <w:rFonts w:eastAsia="Calibri" w:cs="Calibri" w:ascii="Calibri" w:hAnsi="Calibri"/>
+          <w:i/>
+          <w:sz w:val="20"/>
+          <w:szCs w:val="20"/>
+        </w:rPr>
+        <w:t xml:space="preserve"> of </w:t>
       </w:r>
       <w:r>
         <w:rPr>
@@ -1450,7 +3312,16 @@
           <w:sz w:val="20"/>
           <w:szCs w:val="20"/>
         </w:rPr>
-        <w:t xml:space="preserve"> statements in your code.</w:t>
+        <w:t xml:space="preserve"> statements in your code. </w:t>
+      </w:r>
+      <w:r>
+        <w:rPr>
+          <w:rFonts w:eastAsia="Calibri" w:cs="Calibri" w:ascii="Calibri" w:hAnsi="Calibri"/>
+          <w:i/>
+          <w:sz w:val="20"/>
+          <w:szCs w:val="20"/>
+        </w:rPr>
+        <w:t>Just writing assert True (or something very trivial like that) won’t grant you points.</w:t>
       </w:r>
     </w:p>
     <w:p>
@@ -1521,6 +3392,8 @@
       <w:r>
         <w:rPr>
           <w:rFonts w:eastAsia="Calibri" w:cs="Calibri" w:ascii="Calibri" w:hAnsi="Calibri"/>
+          <w:b/>
+          <w:bCs/>
           <w:i/>
           <w:sz w:val="20"/>
           <w:szCs w:val="20"/>
@@ -1534,16 +3407,16 @@
           <w:sz w:val="20"/>
           <w:szCs w:val="20"/>
         </w:rPr>
-        <w:t xml:space="preserve"> extra points. For each day of delay, -10. </w:t>
-      </w:r>
-      <w:r>
-        <w:rPr>
-          <w:rFonts w:eastAsia="Calibri" w:cs="Calibri" w:ascii="Calibri" w:hAnsi="Calibri"/>
-          <w:i/>
-          <w:sz w:val="20"/>
-          <w:szCs w:val="20"/>
-        </w:rPr>
-        <w:t>Be strategic about this.</w:t>
+        <w:t xml:space="preserve"> extra points. For each day of delay, -10. Be strategic about this. </w:t>
+      </w:r>
+      <w:r>
+        <w:rPr>
+          <w:rFonts w:eastAsia="Calibri" w:cs="Calibri" w:ascii="Calibri" w:hAnsi="Calibri"/>
+          <w:i/>
+          <w:sz w:val="20"/>
+          <w:szCs w:val="20"/>
+        </w:rPr>
+        <w:t>(I reduced the relative importance in this task as some of you have other exams ongoing).</w:t>
       </w:r>
     </w:p>
     <w:p>
@@ -1612,16 +3485,7 @@
           <w:sz w:val="20"/>
           <w:szCs w:val="20"/>
         </w:rPr>
-        <w:t xml:space="preserve">Groups of 3 are suggested. </w:t>
-      </w:r>
-      <w:r>
-        <w:rPr>
-          <w:rFonts w:eastAsia="Calibri" w:cs="Calibri" w:ascii="Calibri" w:hAnsi="Calibri"/>
-          <w:i/>
-          <w:sz w:val="20"/>
-          <w:szCs w:val="20"/>
-        </w:rPr>
-        <w:t>If you do not have a group, you will be assigned one. If you are unsatisfied with your group, we can help you to find another one, but we need to be informed within 48hrs from the start of the present project.</w:t>
+        <w:t>Groups of 3 are suggested. If you do not have a group, you will be assigned one. If you are unsatisfied with your group, we can help you to find another one, but we need to be informed within 48hrs from the start of the present project.</w:t>
       </w:r>
     </w:p>
     <w:p>
@@ -1732,15 +3596,16 @@
           <w:sz w:val="20"/>
           <w:szCs w:val="20"/>
         </w:rPr>
+        <w:t>A self reflection statement at the end it is a precious feedback for us.</w:t>
       </w:r>
     </w:p>
     <w:sectPr>
-      <w:headerReference w:type="even" r:id="rId3"/>
-      <w:headerReference w:type="default" r:id="rId4"/>
-      <w:headerReference w:type="first" r:id="rId5"/>
-      <w:footerReference w:type="even" r:id="rId6"/>
-      <w:footerReference w:type="default" r:id="rId7"/>
-      <w:footerReference w:type="first" r:id="rId8"/>
+      <w:headerReference w:type="even" r:id="rId5"/>
+      <w:headerReference w:type="default" r:id="rId6"/>
+      <w:headerReference w:type="first" r:id="rId7"/>
+      <w:footerReference w:type="even" r:id="rId8"/>
+      <w:footerReference w:type="default" r:id="rId9"/>
+      <w:footerReference w:type="first" r:id="rId10"/>
       <w:type w:val="nextPage"/>
       <w:pgSz w:w="11906" w:h="16838"/>
       <w:pgMar w:left="1440" w:right="1440" w:gutter="0" w:header="720" w:top="1440" w:footer="720" w:bottom="1440"/>
@@ -1994,6 +3859,13 @@
       <w:iCs/>
     </w:rPr>
   </w:style>
+  <w:style w:type="character" w:styleId="Hyperlink">
+    <w:name w:val="Hyperlink"/>
+    <w:rPr>
+      <w:color w:val="000080"/>
+      <w:u w:val="single"/>
+    </w:rPr>
+  </w:style>
   <w:style w:type="paragraph" w:styleId="Heading">
     <w:name w:val="Heading"/>
     <w:basedOn w:val="Normal"/>
@@ -2124,6 +3996,19 @@
     <w:basedOn w:val="HeaderandFooter"/>
     <w:pPr/>
     <w:rPr/>
+  </w:style>
+  <w:style w:type="paragraph" w:styleId="PreformattedText">
+    <w:name w:val="Preformatted Text"/>
+    <w:basedOn w:val="Normal"/>
+    <w:qFormat/>
+    <w:pPr>
+      <w:spacing w:before="0" w:after="0"/>
+    </w:pPr>
+    <w:rPr>
+      <w:rFonts w:ascii="Liberation Mono" w:hAnsi="Liberation Mono" w:eastAsia="Noto Sans Mono CJK SC" w:cs="Liberation Mono"/>
+      <w:sz w:val="20"/>
+      <w:szCs w:val="20"/>
+    </w:rPr>
   </w:style>
   <w:style w:type="table" w:default="1" w:styleId="TableNormal">
     <w:name w:val="TableNormal"/>

</xml_diff>